<commit_message>
To Set Real Username and Password for Login System for all User Type
</commit_message>
<xml_diff>
--- a/document/user-panel.docx
+++ b/document/user-panel.docx
@@ -1,6 +1,6 @@
 
 <file path=word/document.xml><?xml version="1.0" encoding="utf-8"?>
-<w:document xmlns:wpc="http://schemas.microsoft.com/office/word/2010/wordprocessingCanvas" xmlns:cx="http://schemas.microsoft.com/office/drawing/2014/chartex" xmlns:cx1="http://schemas.microsoft.com/office/drawing/2015/9/8/chartex" xmlns:cx2="http://schemas.microsoft.com/office/drawing/2015/10/21/chartex" xmlns:cx3="http://schemas.microsoft.com/office/drawing/2016/5/9/chartex" xmlns:cx4="http://schemas.microsoft.com/office/drawing/2016/5/10/chartex" xmlns:cx5="http://schemas.microsoft.com/office/drawing/2016/5/11/chartex" xmlns:cx6="http://schemas.microsoft.com/office/drawing/2016/5/12/chartex" xmlns:cx7="http://schemas.microsoft.com/office/drawing/2016/5/13/chartex" xmlns:cx8="http://schemas.microsoft.com/office/drawing/2016/5/14/chartex" xmlns:mc="http://schemas.openxmlformats.org/markup-compatibility/2006" xmlns:aink="http://schemas.microsoft.com/office/drawing/2016/ink" xmlns:am3d="http://schemas.microsoft.com/office/drawing/2017/model3d" xmlns:o="urn:schemas-microsoft-com:office:office" xmlns:oel="http://schemas.microsoft.com/office/2019/extlst" xmlns:r="http://schemas.openxmlformats.org/officeDocument/2006/relationships" xmlns:m="http://schemas.openxmlformats.org/officeDocument/2006/math" xmlns:v="urn:schemas-microsoft-com:vml" xmlns:wp14="http://schemas.microsoft.com/office/word/2010/wordprocessingDrawing" xmlns:wp="http://schemas.openxmlformats.org/drawingml/2006/wordprocessingDrawing" xmlns:w10="urn:schemas-microsoft-com:office:word" xmlns:w="http://schemas.openxmlformats.org/wordprocessingml/2006/main" xmlns:w14="http://schemas.microsoft.com/office/word/2010/wordml" xmlns:w15="http://schemas.microsoft.com/office/word/2012/wordml" xmlns:w16cei="http://schemas.microsoft.com/office/word/2026/wordml/cei" xmlns:w16cex="http://schemas.microsoft.com/office/word/2018/wordml/cex" xmlns:w16cid="http://schemas.microsoft.com/office/word/2016/wordml/cid" xmlns:w16="http://schemas.microsoft.com/office/word/2018/wordml" xmlns:w16du="http://schemas.microsoft.com/office/word/2023/wordml/word16du" xmlns:w16sdtdh="http://schemas.microsoft.com/office/word/2020/wordml/sdtdatahash" xmlns:w16sdtfl="http://schemas.microsoft.com/office/word/2024/wordml/sdtformatlock" xmlns:w16se="http://schemas.microsoft.com/office/word/2015/wordml/symex" xmlns:wpg="http://schemas.microsoft.com/office/word/2010/wordprocessingGroup" xmlns:wpi="http://schemas.microsoft.com/office/word/2010/wordprocessingInk" xmlns:wne="http://schemas.microsoft.com/office/word/2006/wordml" xmlns:wps="http://schemas.microsoft.com/office/word/2010/wordprocessingShape" mc:Ignorable="w14 w15 w16se w16cid w16 w16cex w16sdtdh w16sdtfl w16du wp14">
+<w:document xmlns:wpc="http://schemas.microsoft.com/office/word/2010/wordprocessingCanvas" xmlns:cx="http://schemas.microsoft.com/office/drawing/2014/chartex" xmlns:cx1="http://schemas.microsoft.com/office/drawing/2015/9/8/chartex" xmlns:cx2="http://schemas.microsoft.com/office/drawing/2015/10/21/chartex" xmlns:cx3="http://schemas.microsoft.com/office/drawing/2016/5/9/chartex" xmlns:cx4="http://schemas.microsoft.com/office/drawing/2016/5/10/chartex" xmlns:cx5="http://schemas.microsoft.com/office/drawing/2016/5/11/chartex" xmlns:cx6="http://schemas.microsoft.com/office/drawing/2016/5/12/chartex" xmlns:cx7="http://schemas.microsoft.com/office/drawing/2016/5/13/chartex" xmlns:cx8="http://schemas.microsoft.com/office/drawing/2016/5/14/chartex" xmlns:mc="http://schemas.openxmlformats.org/markup-compatibility/2006" xmlns:aink="http://schemas.microsoft.com/office/drawing/2016/ink" xmlns:am3d="http://schemas.microsoft.com/office/drawing/2017/model3d" xmlns:o="urn:schemas-microsoft-com:office:office" xmlns:oel="http://schemas.microsoft.com/office/2019/extlst" xmlns:r="http://schemas.openxmlformats.org/officeDocument/2006/relationships" xmlns:m="http://schemas.openxmlformats.org/officeDocument/2006/math" xmlns:v="urn:schemas-microsoft-com:vml" xmlns:wp14="http://schemas.microsoft.com/office/word/2010/wordprocessingDrawing" xmlns:wp="http://schemas.openxmlformats.org/drawingml/2006/wordprocessingDrawing" xmlns:w10="urn:schemas-microsoft-com:office:word" xmlns:w="http://schemas.openxmlformats.org/wordprocessingml/2006/main" xmlns:w14="http://schemas.microsoft.com/office/word/2010/wordml" xmlns:w15="http://schemas.microsoft.com/office/word/2012/wordml" xmlns:w16cex="http://schemas.microsoft.com/office/word/2018/wordml/cex" xmlns:w16cid="http://schemas.microsoft.com/office/word/2016/wordml/cid" xmlns:w16="http://schemas.microsoft.com/office/word/2018/wordml" xmlns:w16du="http://schemas.microsoft.com/office/word/2023/wordml/word16du" xmlns:w16sdtdh="http://schemas.microsoft.com/office/word/2020/wordml/sdtdatahash" xmlns:w16sdtfl="http://schemas.microsoft.com/office/word/2024/wordml/sdtformatlock" xmlns:w16se="http://schemas.microsoft.com/office/word/2015/wordml/symex" xmlns:wpg="http://schemas.microsoft.com/office/word/2010/wordprocessingGroup" xmlns:wpi="http://schemas.microsoft.com/office/word/2010/wordprocessingInk" xmlns:wne="http://schemas.microsoft.com/office/word/2006/wordml" xmlns:wps="http://schemas.microsoft.com/office/word/2010/wordprocessingShape" mc:Ignorable="w14 w15 w16se w16cid w16 w16cex w16sdtdh w16sdtfl w16du wp14">
   <w:body>
     <w:p/>
     <w:p>
@@ -14,8 +14,21 @@
       </w:hyperlink>
     </w:p>
     <w:p>
-      <w:r>
-        <w:t>date : 20 August, 2026</w:t>
+      <w:proofErr w:type="gramStart"/>
+      <w:r>
+        <w:t>date :</w:t>
+      </w:r>
+      <w:proofErr w:type="gramEnd"/>
+      <w:r>
+        <w:t xml:space="preserve"> 20 </w:t>
+      </w:r>
+      <w:proofErr w:type="gramStart"/>
+      <w:r>
+        <w:t>August,</w:t>
+      </w:r>
+      <w:proofErr w:type="gramEnd"/>
+      <w:r>
+        <w:t xml:space="preserve"> 2026</w:t>
       </w:r>
     </w:p>
     <w:p/>
@@ -27,6 +40,9 @@
     <w:p/>
     <w:p>
       <w:r>
+        <w:rPr>
+          <w:noProof/>
+        </w:rPr>
         <w:drawing>
           <wp:inline distT="0" distB="0" distL="0" distR="0" wp14:anchorId="7A27E762" wp14:editId="3C015481">
             <wp:extent cx="5943600" cy="3037205"/>
@@ -119,7 +135,15 @@
     <w:p/>
     <w:p>
       <w:r>
-        <w:t>3. /dashboard/user/tt-history</w:t>
+        <w:t>3. /dashboard/user/</w:t>
+      </w:r>
+      <w:proofErr w:type="spellStart"/>
+      <w:r>
+        <w:t>tt</w:t>
+      </w:r>
+      <w:proofErr w:type="spellEnd"/>
+      <w:r>
+        <w:t>-history</w:t>
       </w:r>
     </w:p>
     <w:p>
@@ -130,8 +154,13 @@
     <w:p/>
     <w:p>
       <w:r>
-        <w:t>4. /dashboard/user/downstream-employees</w:t>
-      </w:r>
+        <w:t>4. /dashboard/user/</w:t>
+      </w:r>
+      <w:proofErr w:type="gramStart"/>
+      <w:r>
+        <w:t>downstream-employees</w:t>
+      </w:r>
+      <w:proofErr w:type="gramEnd"/>
     </w:p>
     <w:p>
       <w:r>
@@ -146,8 +175,13 @@
     <w:p/>
     <w:p>
       <w:r>
-        <w:t>5. /dashboard/user/downstream-device</w:t>
-      </w:r>
+        <w:t>5. /dashboard/user/</w:t>
+      </w:r>
+      <w:proofErr w:type="gramStart"/>
+      <w:r>
+        <w:t>downstream-device</w:t>
+      </w:r>
+      <w:proofErr w:type="gramEnd"/>
     </w:p>
     <w:p>
       <w:r>
@@ -166,12 +200,11 @@
       <w:r>
         <w:t xml:space="preserve">Method </w:t>
       </w:r>
-      <w:r>
-        <w:t>GET</w:t>
-      </w:r>
-      <w:r>
-        <w:t xml:space="preserve"> :</w:t>
-      </w:r>
+      <w:proofErr w:type="gramStart"/>
+      <w:r>
+        <w:t>GET :</w:t>
+      </w:r>
+      <w:proofErr w:type="gramEnd"/>
     </w:p>
     <w:p>
       <w:hyperlink r:id="rId6" w:history="1">
@@ -186,6 +219,9 @@
     <w:p/>
     <w:p>
       <w:r>
+        <w:rPr>
+          <w:noProof/>
+        </w:rPr>
         <w:lastRenderedPageBreak/>
         <w:drawing>
           <wp:inline distT="0" distB="0" distL="0" distR="0" wp14:anchorId="3B9FA894" wp14:editId="19042C15">
@@ -242,17 +278,48 @@
     </w:p>
     <w:p>
       <w:r>
-        <w:t>    "data": {</w:t>
-      </w:r>
-    </w:p>
-    <w:p>
-      <w:r>
-        <w:t>        "device_count": 8,</w:t>
-      </w:r>
-    </w:p>
-    <w:p>
-      <w:r>
-        <w:t>        "ticket_count": 118</w:t>
+        <w:t>    "data</w:t>
+      </w:r>
+      <w:proofErr w:type="gramStart"/>
+      <w:r>
+        <w:t>": {</w:t>
+      </w:r>
+      <w:proofErr w:type="gramEnd"/>
+    </w:p>
+    <w:p>
+      <w:r>
+        <w:t>        "</w:t>
+      </w:r>
+      <w:proofErr w:type="spellStart"/>
+      <w:proofErr w:type="gramStart"/>
+      <w:r>
+        <w:t>device</w:t>
+      </w:r>
+      <w:proofErr w:type="gramEnd"/>
+      <w:r>
+        <w:t>_count</w:t>
+      </w:r>
+      <w:proofErr w:type="spellEnd"/>
+      <w:r>
+        <w:t>": 8,</w:t>
+      </w:r>
+    </w:p>
+    <w:p>
+      <w:r>
+        <w:t>        "</w:t>
+      </w:r>
+      <w:proofErr w:type="spellStart"/>
+      <w:proofErr w:type="gramStart"/>
+      <w:r>
+        <w:t>ticket</w:t>
+      </w:r>
+      <w:proofErr w:type="gramEnd"/>
+      <w:r>
+        <w:t>_count</w:t>
+      </w:r>
+      <w:proofErr w:type="spellEnd"/>
+      <w:r>
+        <w:t>": 118</w:t>
       </w:r>
     </w:p>
     <w:p>
@@ -280,6 +347,9 @@
     <w:p/>
     <w:p>
       <w:r>
+        <w:rPr>
+          <w:noProof/>
+        </w:rPr>
         <w:lastRenderedPageBreak/>
         <w:drawing>
           <wp:inline distT="0" distB="0" distL="0" distR="0" wp14:anchorId="0BFA7418" wp14:editId="6CA04701">
@@ -322,6 +392,9 @@
     <w:p/>
     <w:p>
       <w:r>
+        <w:rPr>
+          <w:noProof/>
+        </w:rPr>
         <w:drawing>
           <wp:inline distT="0" distB="0" distL="0" distR="0" wp14:anchorId="145B5D14" wp14:editId="6D09E3F8">
             <wp:extent cx="5943600" cy="3052445"/>
@@ -413,7 +486,15 @@
     </w:p>
     <w:p>
       <w:r>
-        <w:t>/dashboard/user/tt-history</w:t>
+        <w:t>/dashboard/user/</w:t>
+      </w:r>
+      <w:proofErr w:type="spellStart"/>
+      <w:r>
+        <w:t>tt</w:t>
+      </w:r>
+      <w:proofErr w:type="spellEnd"/>
+      <w:r>
+        <w:t>-history</w:t>
       </w:r>
     </w:p>
     <w:p>
@@ -451,7 +532,15 @@
     </w:p>
     <w:p>
       <w:r>
-        <w:t xml:space="preserve">    device_serial,</w:t>
+        <w:t xml:space="preserve">    </w:t>
+      </w:r>
+      <w:proofErr w:type="spellStart"/>
+      <w:r>
+        <w:t>device_serial</w:t>
+      </w:r>
+      <w:proofErr w:type="spellEnd"/>
+      <w:r>
+        <w:t>,</w:t>
       </w:r>
     </w:p>
     <w:p>
@@ -471,12 +560,28 @@
     </w:p>
     <w:p>
       <w:r>
-        <w:t xml:space="preserve">    emp_id,</w:t>
-      </w:r>
-    </w:p>
-    <w:p>
-      <w:r>
-        <w:t xml:space="preserve">    emp_name,</w:t>
+        <w:t xml:space="preserve">    </w:t>
+      </w:r>
+      <w:proofErr w:type="spellStart"/>
+      <w:r>
+        <w:t>emp_id</w:t>
+      </w:r>
+      <w:proofErr w:type="spellEnd"/>
+      <w:r>
+        <w:t>,</w:t>
+      </w:r>
+    </w:p>
+    <w:p>
+      <w:r>
+        <w:t xml:space="preserve">    </w:t>
+      </w:r>
+      <w:proofErr w:type="spellStart"/>
+      <w:r>
+        <w:t>emp_name</w:t>
+      </w:r>
+      <w:proofErr w:type="spellEnd"/>
+      <w:r>
+        <w:t>,</w:t>
       </w:r>
     </w:p>
     <w:p>
@@ -491,63 +596,160 @@
     </w:p>
     <w:p>
       <w:r>
-        <w:t xml:space="preserve">    mr_number,</w:t>
-      </w:r>
-    </w:p>
-    <w:p>
-      <w:r>
-        <w:t xml:space="preserve">    pr_number,</w:t>
-      </w:r>
-    </w:p>
-    <w:p>
-      <w:r>
-        <w:t xml:space="preserve">    assigned_date,</w:t>
-      </w:r>
-    </w:p>
-    <w:p>
-      <w:r>
-        <w:t xml:space="preserve">    purchase_date,</w:t>
-      </w:r>
-    </w:p>
-    <w:p>
-      <w:r>
-        <w:t xml:space="preserve">    warranty_date,</w:t>
+        <w:t xml:space="preserve">    </w:t>
+      </w:r>
+      <w:proofErr w:type="spellStart"/>
+      <w:r>
+        <w:t>mr_number</w:t>
+      </w:r>
+      <w:proofErr w:type="spellEnd"/>
+      <w:r>
+        <w:t>,</w:t>
+      </w:r>
+    </w:p>
+    <w:p>
+      <w:r>
+        <w:t xml:space="preserve">    </w:t>
+      </w:r>
+      <w:proofErr w:type="spellStart"/>
+      <w:r>
+        <w:t>pr_number</w:t>
+      </w:r>
+      <w:proofErr w:type="spellEnd"/>
+      <w:r>
+        <w:t>,</w:t>
+      </w:r>
+    </w:p>
+    <w:p>
+      <w:r>
+        <w:t xml:space="preserve">    </w:t>
+      </w:r>
+      <w:proofErr w:type="spellStart"/>
+      <w:r>
+        <w:t>assigned_date</w:t>
+      </w:r>
+      <w:proofErr w:type="spellEnd"/>
+      <w:r>
+        <w:t>,</w:t>
+      </w:r>
+    </w:p>
+    <w:p>
+      <w:r>
+        <w:t xml:space="preserve">    </w:t>
+      </w:r>
+      <w:proofErr w:type="spellStart"/>
+      <w:r>
+        <w:t>purchase_date</w:t>
+      </w:r>
+      <w:proofErr w:type="spellEnd"/>
+      <w:r>
+        <w:t>,</w:t>
+      </w:r>
+    </w:p>
+    <w:p>
+      <w:r>
+        <w:t xml:space="preserve">    </w:t>
+      </w:r>
+      <w:proofErr w:type="spellStart"/>
+      <w:r>
+        <w:t>warranty_date</w:t>
+      </w:r>
+      <w:proofErr w:type="spellEnd"/>
+      <w:r>
+        <w:t>,</w:t>
       </w:r>
     </w:p>
     <w:p>
       <w:r>
         <w:lastRenderedPageBreak/>
-        <w:t xml:space="preserve">    asset_status,</w:t>
-      </w:r>
-    </w:p>
-    <w:p>
-      <w:r>
-        <w:t xml:space="preserve">    row_status</w:t>
-      </w:r>
-    </w:p>
-    <w:p>
-      <w:r>
-        <w:t>FROM public.asset_devices</w:t>
-      </w:r>
-    </w:p>
-    <w:p>
-      <w:r>
-        <w:t>WHERE row_status = 1</w:t>
-      </w:r>
-    </w:p>
-    <w:p>
-      <w:r>
-        <w:t xml:space="preserve">  AND asset_status = 1</w:t>
-      </w:r>
-    </w:p>
-    <w:p>
-      <w:r>
-        <w:t xml:space="preserve">  AND BTRIM(</w:t>
-      </w:r>
-    </w:p>
-    <w:p>
-      <w:r>
-        <w:t xml:space="preserve">        COALESCE(emp_id, '')</w:t>
+        <w:t xml:space="preserve">    </w:t>
+      </w:r>
+      <w:proofErr w:type="spellStart"/>
+      <w:r>
+        <w:t>asset_status</w:t>
+      </w:r>
+      <w:proofErr w:type="spellEnd"/>
+      <w:r>
+        <w:t>,</w:t>
+      </w:r>
+    </w:p>
+    <w:p>
+      <w:r>
+        <w:t xml:space="preserve">    </w:t>
+      </w:r>
+      <w:proofErr w:type="spellStart"/>
+      <w:r>
+        <w:t>row_status</w:t>
+      </w:r>
+      <w:proofErr w:type="spellEnd"/>
+    </w:p>
+    <w:p>
+      <w:r>
+        <w:t xml:space="preserve">FROM </w:t>
+      </w:r>
+      <w:proofErr w:type="spellStart"/>
+      <w:proofErr w:type="gramStart"/>
+      <w:r>
+        <w:t>public.asset</w:t>
+      </w:r>
+      <w:proofErr w:type="gramEnd"/>
+      <w:r>
+        <w:t>_devices</w:t>
+      </w:r>
+      <w:proofErr w:type="spellEnd"/>
+    </w:p>
+    <w:p>
+      <w:r>
+        <w:t xml:space="preserve">WHERE </w:t>
+      </w:r>
+      <w:proofErr w:type="spellStart"/>
+      <w:r>
+        <w:t>row_status</w:t>
+      </w:r>
+      <w:proofErr w:type="spellEnd"/>
+      <w:r>
+        <w:t xml:space="preserve"> = 1</w:t>
+      </w:r>
+    </w:p>
+    <w:p>
+      <w:r>
+        <w:t xml:space="preserve">  AND </w:t>
+      </w:r>
+      <w:proofErr w:type="spellStart"/>
+      <w:r>
+        <w:t>asset_status</w:t>
+      </w:r>
+      <w:proofErr w:type="spellEnd"/>
+      <w:r>
+        <w:t xml:space="preserve"> = 1</w:t>
+      </w:r>
+    </w:p>
+    <w:p>
+      <w:r>
+        <w:t xml:space="preserve">  AND </w:t>
+      </w:r>
+      <w:proofErr w:type="gramStart"/>
+      <w:r>
+        <w:t>BTRIM(</w:t>
+      </w:r>
+      <w:proofErr w:type="gramEnd"/>
+    </w:p>
+    <w:p>
+      <w:r>
+        <w:t xml:space="preserve">        </w:t>
+      </w:r>
+      <w:proofErr w:type="gramStart"/>
+      <w:r>
+        <w:t>COALESCE(</w:t>
+      </w:r>
+      <w:proofErr w:type="spellStart"/>
+      <w:proofErr w:type="gramEnd"/>
+      <w:r>
+        <w:t>emp_id</w:t>
+      </w:r>
+      <w:proofErr w:type="spellEnd"/>
+      <w:r>
+        <w:t>, '')</w:t>
       </w:r>
     </w:p>
     <w:p>
@@ -562,7 +764,15 @@
     </w:p>
     <w:p>
       <w:r>
-        <w:t xml:space="preserve">    assigned_date DESC NULLS LAST,</w:t>
+        <w:t xml:space="preserve">    </w:t>
+      </w:r>
+      <w:proofErr w:type="spellStart"/>
+      <w:r>
+        <w:t>assigned_date</w:t>
+      </w:r>
+      <w:proofErr w:type="spellEnd"/>
+      <w:r>
+        <w:t xml:space="preserve"> DESC NULLS LAST,</w:t>
       </w:r>
     </w:p>
     <w:p>
@@ -574,6 +784,9 @@
     <w:p/>
     <w:p>
       <w:r>
+        <w:rPr>
+          <w:noProof/>
+        </w:rPr>
         <w:drawing>
           <wp:inline distT="0" distB="0" distL="0" distR="0" wp14:anchorId="3BA4F4F2" wp14:editId="24F28187">
             <wp:extent cx="5943600" cy="3164205"/>
@@ -646,7 +859,20 @@
     </w:p>
     <w:p>
       <w:r>
-        <w:t>            "device_serial": "202206210183",</w:t>
+        <w:t>            "</w:t>
+      </w:r>
+      <w:proofErr w:type="spellStart"/>
+      <w:proofErr w:type="gramStart"/>
+      <w:r>
+        <w:t>device</w:t>
+      </w:r>
+      <w:proofErr w:type="gramEnd"/>
+      <w:r>
+        <w:t>_serial</w:t>
+      </w:r>
+      <w:proofErr w:type="spellEnd"/>
+      <w:r>
+        <w:t>": "202206210183",</w:t>
       </w:r>
     </w:p>
     <w:p>
@@ -661,17 +887,46 @@
     </w:p>
     <w:p>
       <w:r>
-        <w:t>            "model": "NPS Model:NP2120 (MetalBody)",</w:t>
-      </w:r>
-    </w:p>
-    <w:p>
-      <w:r>
-        <w:t>            "employee_id": "02-0003",</w:t>
-      </w:r>
-    </w:p>
-    <w:p>
-      <w:r>
-        <w:t>            "employee_name": "Brig Gen Md. Rafiqur Rahman, psc (retd)",</w:t>
+        <w:t>            "model": "NPS Model:NP2120 (</w:t>
+      </w:r>
+      <w:proofErr w:type="spellStart"/>
+      <w:r>
+        <w:t>MetalBody</w:t>
+      </w:r>
+      <w:proofErr w:type="spellEnd"/>
+      <w:r>
+        <w:t>)",</w:t>
+      </w:r>
+    </w:p>
+    <w:p>
+      <w:r>
+        <w:t>            "</w:t>
+      </w:r>
+      <w:proofErr w:type="spellStart"/>
+      <w:proofErr w:type="gramStart"/>
+      <w:r>
+        <w:t>employee</w:t>
+      </w:r>
+      <w:proofErr w:type="gramEnd"/>
+      <w:r>
+        <w:t>_id</w:t>
+      </w:r>
+      <w:proofErr w:type="spellEnd"/>
+      <w:r>
+        <w:t>": "02-0003",</w:t>
+      </w:r>
+    </w:p>
+    <w:p>
+      <w:r>
+        <w:t>            "</w:t>
+      </w:r>
+      <w:proofErr w:type="gramStart"/>
+      <w:r>
+        <w:t>employee</w:t>
+      </w:r>
+      <w:proofErr w:type="gramEnd"/>
+      <w:r>
+        <w:t>_name": "Brig Gen Md. Rafiqur Rahman, psc (retd)",</w:t>
       </w:r>
     </w:p>
     <w:p>
@@ -686,27 +941,92 @@
     </w:p>
     <w:p>
       <w:r>
-        <w:t>            "mr_number": "",</w:t>
-      </w:r>
-    </w:p>
-    <w:p>
-      <w:r>
-        <w:t>            "pr_number": "FAHSC02-20142024-05-02PR12149",</w:t>
-      </w:r>
-    </w:p>
-    <w:p>
-      <w:r>
-        <w:t>            "assigned_date": "2024-08-27 13:11:22+06",</w:t>
-      </w:r>
-    </w:p>
-    <w:p>
-      <w:r>
-        <w:t>            "purchase_date": "",</w:t>
-      </w:r>
-    </w:p>
-    <w:p>
-      <w:r>
-        <w:t>            "warranty_date": "2025-08-27 13:11:41+06",</w:t>
+        <w:t>            "</w:t>
+      </w:r>
+      <w:proofErr w:type="spellStart"/>
+      <w:proofErr w:type="gramStart"/>
+      <w:r>
+        <w:t>mr</w:t>
+      </w:r>
+      <w:proofErr w:type="gramEnd"/>
+      <w:r>
+        <w:t>_number</w:t>
+      </w:r>
+      <w:proofErr w:type="spellEnd"/>
+      <w:r>
+        <w:t>": "",</w:t>
+      </w:r>
+    </w:p>
+    <w:p>
+      <w:r>
+        <w:t>            "</w:t>
+      </w:r>
+      <w:proofErr w:type="spellStart"/>
+      <w:proofErr w:type="gramStart"/>
+      <w:r>
+        <w:t>pr</w:t>
+      </w:r>
+      <w:proofErr w:type="gramEnd"/>
+      <w:r>
+        <w:t>_number</w:t>
+      </w:r>
+      <w:proofErr w:type="spellEnd"/>
+      <w:r>
+        <w:t>": "FAHSC02-20142024-05-02PR12149",</w:t>
+      </w:r>
+    </w:p>
+    <w:p>
+      <w:r>
+        <w:t>            "</w:t>
+      </w:r>
+      <w:proofErr w:type="spellStart"/>
+      <w:proofErr w:type="gramStart"/>
+      <w:r>
+        <w:t>assigned</w:t>
+      </w:r>
+      <w:proofErr w:type="gramEnd"/>
+      <w:r>
+        <w:t>_date</w:t>
+      </w:r>
+      <w:proofErr w:type="spellEnd"/>
+      <w:r>
+        <w:t>": "2024-08-27 13:11:22+06",</w:t>
+      </w:r>
+    </w:p>
+    <w:p>
+      <w:r>
+        <w:t>            "</w:t>
+      </w:r>
+      <w:proofErr w:type="spellStart"/>
+      <w:proofErr w:type="gramStart"/>
+      <w:r>
+        <w:t>purchase</w:t>
+      </w:r>
+      <w:proofErr w:type="gramEnd"/>
+      <w:r>
+        <w:t>_date</w:t>
+      </w:r>
+      <w:proofErr w:type="spellEnd"/>
+      <w:r>
+        <w:t>": "",</w:t>
+      </w:r>
+    </w:p>
+    <w:p>
+      <w:r>
+        <w:t>            "</w:t>
+      </w:r>
+      <w:proofErr w:type="spellStart"/>
+      <w:proofErr w:type="gramStart"/>
+      <w:r>
+        <w:t>warranty</w:t>
+      </w:r>
+      <w:proofErr w:type="gramEnd"/>
+      <w:r>
+        <w:t>_date</w:t>
+      </w:r>
+      <w:proofErr w:type="spellEnd"/>
+      <w:r>
+        <w:t>": "2025-08-27 13:11:41+06",</w:t>
       </w:r>
     </w:p>
     <w:p>
@@ -731,7 +1051,20 @@
     </w:p>
     <w:p>
       <w:r>
-        <w:t>            "device_serial": "JR-W020-N/A",</w:t>
+        <w:t>            "</w:t>
+      </w:r>
+      <w:proofErr w:type="spellStart"/>
+      <w:proofErr w:type="gramStart"/>
+      <w:r>
+        <w:t>device</w:t>
+      </w:r>
+      <w:proofErr w:type="gramEnd"/>
+      <w:r>
+        <w:t>_serial</w:t>
+      </w:r>
+      <w:proofErr w:type="spellEnd"/>
+      <w:r>
+        <w:t>": "JR-W020-N/A",</w:t>
       </w:r>
     </w:p>
     <w:p>
@@ -741,7 +1074,15 @@
     </w:p>
     <w:p>
       <w:r>
-        <w:t>            "brand": "JoyRoom",</w:t>
+        <w:t>            "brand": "</w:t>
+      </w:r>
+      <w:proofErr w:type="spellStart"/>
+      <w:r>
+        <w:t>JoyRoom</w:t>
+      </w:r>
+      <w:proofErr w:type="spellEnd"/>
+      <w:r>
+        <w:t>",</w:t>
       </w:r>
     </w:p>
     <w:p>
@@ -752,12 +1093,33 @@
     </w:p>
     <w:p>
       <w:r>
-        <w:t>            "employee_id": "02-0003",</w:t>
-      </w:r>
-    </w:p>
-    <w:p>
-      <w:r>
-        <w:t>            "employee_name": "Brig Gen Md. Rafiqur Rahman, psc (retd)",</w:t>
+        <w:t>            "</w:t>
+      </w:r>
+      <w:proofErr w:type="spellStart"/>
+      <w:proofErr w:type="gramStart"/>
+      <w:r>
+        <w:t>employee</w:t>
+      </w:r>
+      <w:proofErr w:type="gramEnd"/>
+      <w:r>
+        <w:t>_id</w:t>
+      </w:r>
+      <w:proofErr w:type="spellEnd"/>
+      <w:r>
+        <w:t>": "02-0003",</w:t>
+      </w:r>
+    </w:p>
+    <w:p>
+      <w:r>
+        <w:t>            "</w:t>
+      </w:r>
+      <w:proofErr w:type="gramStart"/>
+      <w:r>
+        <w:t>employee</w:t>
+      </w:r>
+      <w:proofErr w:type="gramEnd"/>
+      <w:r>
+        <w:t>_name": "Brig Gen Md. Rafiqur Rahman, psc (retd)",</w:t>
       </w:r>
     </w:p>
     <w:p>
@@ -772,27 +1134,92 @@
     </w:p>
     <w:p>
       <w:r>
-        <w:t>            "mr_number": "",</w:t>
-      </w:r>
-    </w:p>
-    <w:p>
-      <w:r>
-        <w:t>            "pr_number": "",</w:t>
-      </w:r>
-    </w:p>
-    <w:p>
-      <w:r>
-        <w:t>            "assigned_date": "2023-06-03 12:10:04+06",</w:t>
-      </w:r>
-    </w:p>
-    <w:p>
-      <w:r>
-        <w:t>            "purchase_date": "",</w:t>
-      </w:r>
-    </w:p>
-    <w:p>
-      <w:r>
-        <w:t>            "warranty_date": "",</w:t>
+        <w:t>            "</w:t>
+      </w:r>
+      <w:proofErr w:type="spellStart"/>
+      <w:proofErr w:type="gramStart"/>
+      <w:r>
+        <w:t>mr</w:t>
+      </w:r>
+      <w:proofErr w:type="gramEnd"/>
+      <w:r>
+        <w:t>_number</w:t>
+      </w:r>
+      <w:proofErr w:type="spellEnd"/>
+      <w:r>
+        <w:t>": "",</w:t>
+      </w:r>
+    </w:p>
+    <w:p>
+      <w:r>
+        <w:t>            "</w:t>
+      </w:r>
+      <w:proofErr w:type="spellStart"/>
+      <w:proofErr w:type="gramStart"/>
+      <w:r>
+        <w:t>pr</w:t>
+      </w:r>
+      <w:proofErr w:type="gramEnd"/>
+      <w:r>
+        <w:t>_number</w:t>
+      </w:r>
+      <w:proofErr w:type="spellEnd"/>
+      <w:r>
+        <w:t>": "",</w:t>
+      </w:r>
+    </w:p>
+    <w:p>
+      <w:r>
+        <w:t>            "</w:t>
+      </w:r>
+      <w:proofErr w:type="spellStart"/>
+      <w:proofErr w:type="gramStart"/>
+      <w:r>
+        <w:t>assigned</w:t>
+      </w:r>
+      <w:proofErr w:type="gramEnd"/>
+      <w:r>
+        <w:t>_date</w:t>
+      </w:r>
+      <w:proofErr w:type="spellEnd"/>
+      <w:r>
+        <w:t>": "2023-06-03 12:10:04+06",</w:t>
+      </w:r>
+    </w:p>
+    <w:p>
+      <w:r>
+        <w:t>            "</w:t>
+      </w:r>
+      <w:proofErr w:type="spellStart"/>
+      <w:proofErr w:type="gramStart"/>
+      <w:r>
+        <w:t>purchase</w:t>
+      </w:r>
+      <w:proofErr w:type="gramEnd"/>
+      <w:r>
+        <w:t>_date</w:t>
+      </w:r>
+      <w:proofErr w:type="spellEnd"/>
+      <w:r>
+        <w:t>": "",</w:t>
+      </w:r>
+    </w:p>
+    <w:p>
+      <w:r>
+        <w:t>            "</w:t>
+      </w:r>
+      <w:proofErr w:type="spellStart"/>
+      <w:proofErr w:type="gramStart"/>
+      <w:r>
+        <w:t>warranty</w:t>
+      </w:r>
+      <w:proofErr w:type="gramEnd"/>
+      <w:r>
+        <w:t>_date</w:t>
+      </w:r>
+      <w:proofErr w:type="spellEnd"/>
+      <w:r>
+        <w:t>": "",</w:t>
       </w:r>
     </w:p>
     <w:p>
@@ -817,7 +1244,20 @@
     </w:p>
     <w:p>
       <w:r>
-        <w:t>            "device_serial": "5511259",</w:t>
+        <w:t>            "</w:t>
+      </w:r>
+      <w:proofErr w:type="spellStart"/>
+      <w:proofErr w:type="gramStart"/>
+      <w:r>
+        <w:t>device</w:t>
+      </w:r>
+      <w:proofErr w:type="gramEnd"/>
+      <w:r>
+        <w:t>_serial</w:t>
+      </w:r>
+      <w:proofErr w:type="spellEnd"/>
+      <w:r>
+        <w:t>": "5511259",</w:t>
       </w:r>
     </w:p>
     <w:p>
@@ -837,12 +1277,33 @@
     </w:p>
     <w:p>
       <w:r>
-        <w:t>            "employee_id": "02-0003",</w:t>
-      </w:r>
-    </w:p>
-    <w:p>
-      <w:r>
-        <w:t>            "employee_name": "Brig Gen Md. Rafiqur Rahman, psc (retd)",</w:t>
+        <w:t>            "</w:t>
+      </w:r>
+      <w:proofErr w:type="spellStart"/>
+      <w:proofErr w:type="gramStart"/>
+      <w:r>
+        <w:t>employee</w:t>
+      </w:r>
+      <w:proofErr w:type="gramEnd"/>
+      <w:r>
+        <w:t>_id</w:t>
+      </w:r>
+      <w:proofErr w:type="spellEnd"/>
+      <w:r>
+        <w:t>": "02-0003",</w:t>
+      </w:r>
+    </w:p>
+    <w:p>
+      <w:r>
+        <w:t>            "</w:t>
+      </w:r>
+      <w:proofErr w:type="gramStart"/>
+      <w:r>
+        <w:t>employee</w:t>
+      </w:r>
+      <w:proofErr w:type="gramEnd"/>
+      <w:r>
+        <w:t>_name": "Brig Gen Md. Rafiqur Rahman, psc (retd)",</w:t>
       </w:r>
     </w:p>
     <w:p>
@@ -857,28 +1318,93 @@
     </w:p>
     <w:p>
       <w:r>
-        <w:t>            "mr_number": "",</w:t>
-      </w:r>
-    </w:p>
-    <w:p>
-      <w:r>
-        <w:t>            "pr_number": "FAHSC02-04672022-06-09PR9645C",</w:t>
-      </w:r>
-    </w:p>
-    <w:p>
-      <w:r>
-        <w:t>            "assigned_date": "2023-01-01 17:56:30+06",</w:t>
-      </w:r>
-    </w:p>
-    <w:p>
-      <w:r>
-        <w:t>            "purchase_date": "",</w:t>
+        <w:t>            "</w:t>
+      </w:r>
+      <w:proofErr w:type="spellStart"/>
+      <w:proofErr w:type="gramStart"/>
+      <w:r>
+        <w:t>mr</w:t>
+      </w:r>
+      <w:proofErr w:type="gramEnd"/>
+      <w:r>
+        <w:t>_number</w:t>
+      </w:r>
+      <w:proofErr w:type="spellEnd"/>
+      <w:r>
+        <w:t>": "",</w:t>
+      </w:r>
+    </w:p>
+    <w:p>
+      <w:r>
+        <w:t>            "</w:t>
+      </w:r>
+      <w:proofErr w:type="spellStart"/>
+      <w:proofErr w:type="gramStart"/>
+      <w:r>
+        <w:t>pr</w:t>
+      </w:r>
+      <w:proofErr w:type="gramEnd"/>
+      <w:r>
+        <w:t>_number</w:t>
+      </w:r>
+      <w:proofErr w:type="spellEnd"/>
+      <w:r>
+        <w:t>": "FAHSC02-04672022-06-09PR9645C",</w:t>
+      </w:r>
+    </w:p>
+    <w:p>
+      <w:r>
+        <w:t>            "</w:t>
+      </w:r>
+      <w:proofErr w:type="spellStart"/>
+      <w:proofErr w:type="gramStart"/>
+      <w:r>
+        <w:t>assigned</w:t>
+      </w:r>
+      <w:proofErr w:type="gramEnd"/>
+      <w:r>
+        <w:t>_date</w:t>
+      </w:r>
+      <w:proofErr w:type="spellEnd"/>
+      <w:r>
+        <w:t>": "2023-01-01 17:56:30+06",</w:t>
+      </w:r>
+    </w:p>
+    <w:p>
+      <w:r>
+        <w:t>            "</w:t>
+      </w:r>
+      <w:proofErr w:type="spellStart"/>
+      <w:proofErr w:type="gramStart"/>
+      <w:r>
+        <w:t>purchase</w:t>
+      </w:r>
+      <w:proofErr w:type="gramEnd"/>
+      <w:r>
+        <w:t>_date</w:t>
+      </w:r>
+      <w:proofErr w:type="spellEnd"/>
+      <w:r>
+        <w:t>": "",</w:t>
       </w:r>
     </w:p>
     <w:p>
       <w:r>
         <w:lastRenderedPageBreak/>
-        <w:t>            "warranty_date": "",</w:t>
+        <w:t>            "</w:t>
+      </w:r>
+      <w:proofErr w:type="spellStart"/>
+      <w:proofErr w:type="gramStart"/>
+      <w:r>
+        <w:t>warranty</w:t>
+      </w:r>
+      <w:proofErr w:type="gramEnd"/>
+      <w:r>
+        <w:t>_date</w:t>
+      </w:r>
+      <w:proofErr w:type="spellEnd"/>
+      <w:r>
+        <w:t>": "",</w:t>
       </w:r>
     </w:p>
     <w:p>
@@ -903,7 +1429,20 @@
     </w:p>
     <w:p>
       <w:r>
-        <w:t>            "device_serial": "WXA2AC0R7PJY",</w:t>
+        <w:t>            "</w:t>
+      </w:r>
+      <w:proofErr w:type="spellStart"/>
+      <w:proofErr w:type="gramStart"/>
+      <w:r>
+        <w:t>device</w:t>
+      </w:r>
+      <w:proofErr w:type="gramEnd"/>
+      <w:r>
+        <w:t>_serial</w:t>
+      </w:r>
+      <w:proofErr w:type="spellEnd"/>
+      <w:r>
+        <w:t>": "WXA2AC0R7PJY",</w:t>
       </w:r>
     </w:p>
     <w:p>
@@ -923,12 +1462,33 @@
     </w:p>
     <w:p>
       <w:r>
-        <w:t>            "employee_id": "02-0003",</w:t>
-      </w:r>
-    </w:p>
-    <w:p>
-      <w:r>
-        <w:t>            "employee_name": "Brig Gen Md. Rafiqur Rahman, psc (retd)",</w:t>
+        <w:t>            "</w:t>
+      </w:r>
+      <w:proofErr w:type="spellStart"/>
+      <w:proofErr w:type="gramStart"/>
+      <w:r>
+        <w:t>employee</w:t>
+      </w:r>
+      <w:proofErr w:type="gramEnd"/>
+      <w:r>
+        <w:t>_id</w:t>
+      </w:r>
+      <w:proofErr w:type="spellEnd"/>
+      <w:r>
+        <w:t>": "02-0003",</w:t>
+      </w:r>
+    </w:p>
+    <w:p>
+      <w:r>
+        <w:t>            "</w:t>
+      </w:r>
+      <w:proofErr w:type="gramStart"/>
+      <w:r>
+        <w:t>employee</w:t>
+      </w:r>
+      <w:proofErr w:type="gramEnd"/>
+      <w:r>
+        <w:t>_name": "Brig Gen Md. Rafiqur Rahman, psc (retd)",</w:t>
       </w:r>
     </w:p>
     <w:p>
@@ -943,27 +1503,92 @@
     </w:p>
     <w:p>
       <w:r>
-        <w:t>            "mr_number": "",</w:t>
-      </w:r>
-    </w:p>
-    <w:p>
-      <w:r>
-        <w:t>            "pr_number": "",</w:t>
-      </w:r>
-    </w:p>
-    <w:p>
-      <w:r>
-        <w:t>            "assigned_date": "2021-11-15 17:27:05+06",</w:t>
-      </w:r>
-    </w:p>
-    <w:p>
-      <w:r>
-        <w:t>            "purchase_date": "",</w:t>
-      </w:r>
-    </w:p>
-    <w:p>
-      <w:r>
-        <w:t>            "warranty_date": "",</w:t>
+        <w:t>            "</w:t>
+      </w:r>
+      <w:proofErr w:type="spellStart"/>
+      <w:proofErr w:type="gramStart"/>
+      <w:r>
+        <w:t>mr</w:t>
+      </w:r>
+      <w:proofErr w:type="gramEnd"/>
+      <w:r>
+        <w:t>_number</w:t>
+      </w:r>
+      <w:proofErr w:type="spellEnd"/>
+      <w:r>
+        <w:t>": "",</w:t>
+      </w:r>
+    </w:p>
+    <w:p>
+      <w:r>
+        <w:t>            "</w:t>
+      </w:r>
+      <w:proofErr w:type="spellStart"/>
+      <w:proofErr w:type="gramStart"/>
+      <w:r>
+        <w:t>pr</w:t>
+      </w:r>
+      <w:proofErr w:type="gramEnd"/>
+      <w:r>
+        <w:t>_number</w:t>
+      </w:r>
+      <w:proofErr w:type="spellEnd"/>
+      <w:r>
+        <w:t>": "",</w:t>
+      </w:r>
+    </w:p>
+    <w:p>
+      <w:r>
+        <w:t>            "</w:t>
+      </w:r>
+      <w:proofErr w:type="spellStart"/>
+      <w:proofErr w:type="gramStart"/>
+      <w:r>
+        <w:t>assigned</w:t>
+      </w:r>
+      <w:proofErr w:type="gramEnd"/>
+      <w:r>
+        <w:t>_date</w:t>
+      </w:r>
+      <w:proofErr w:type="spellEnd"/>
+      <w:r>
+        <w:t>": "2021-11-15 17:27:05+06",</w:t>
+      </w:r>
+    </w:p>
+    <w:p>
+      <w:r>
+        <w:t>            "</w:t>
+      </w:r>
+      <w:proofErr w:type="spellStart"/>
+      <w:proofErr w:type="gramStart"/>
+      <w:r>
+        <w:t>purchase</w:t>
+      </w:r>
+      <w:proofErr w:type="gramEnd"/>
+      <w:r>
+        <w:t>_date</w:t>
+      </w:r>
+      <w:proofErr w:type="spellEnd"/>
+      <w:r>
+        <w:t>": "",</w:t>
+      </w:r>
+    </w:p>
+    <w:p>
+      <w:r>
+        <w:t>            "</w:t>
+      </w:r>
+      <w:proofErr w:type="spellStart"/>
+      <w:proofErr w:type="gramStart"/>
+      <w:r>
+        <w:t>warranty</w:t>
+      </w:r>
+      <w:proofErr w:type="gramEnd"/>
+      <w:r>
+        <w:t>_date</w:t>
+      </w:r>
+      <w:proofErr w:type="spellEnd"/>
+      <w:r>
+        <w:t>": "",</w:t>
       </w:r>
     </w:p>
     <w:p>
@@ -988,7 +1613,20 @@
     </w:p>
     <w:p>
       <w:r>
-        <w:t>            "device_serial": "CND04420KX",</w:t>
+        <w:t>            "</w:t>
+      </w:r>
+      <w:proofErr w:type="spellStart"/>
+      <w:proofErr w:type="gramStart"/>
+      <w:r>
+        <w:t>device</w:t>
+      </w:r>
+      <w:proofErr w:type="gramEnd"/>
+      <w:r>
+        <w:t>_serial</w:t>
+      </w:r>
+      <w:proofErr w:type="spellEnd"/>
+      <w:r>
+        <w:t>": "CND04420KX",</w:t>
       </w:r>
     </w:p>
     <w:p>
@@ -1009,12 +1647,33 @@
     <w:p>
       <w:r>
         <w:lastRenderedPageBreak/>
-        <w:t>            "employee_id": "02-0003",</w:t>
-      </w:r>
-    </w:p>
-    <w:p>
-      <w:r>
-        <w:t>            "employee_name": "Brig Gen Md. Rafiqur Rahman, psc (retd)",</w:t>
+        <w:t>            "</w:t>
+      </w:r>
+      <w:proofErr w:type="spellStart"/>
+      <w:proofErr w:type="gramStart"/>
+      <w:r>
+        <w:t>employee</w:t>
+      </w:r>
+      <w:proofErr w:type="gramEnd"/>
+      <w:r>
+        <w:t>_id</w:t>
+      </w:r>
+      <w:proofErr w:type="spellEnd"/>
+      <w:r>
+        <w:t>": "02-0003",</w:t>
+      </w:r>
+    </w:p>
+    <w:p>
+      <w:r>
+        <w:t>            "</w:t>
+      </w:r>
+      <w:proofErr w:type="gramStart"/>
+      <w:r>
+        <w:t>employee</w:t>
+      </w:r>
+      <w:proofErr w:type="gramEnd"/>
+      <w:r>
+        <w:t>_name": "Brig Gen Md. Rafiqur Rahman, psc (retd)",</w:t>
       </w:r>
     </w:p>
     <w:p>
@@ -1029,27 +1688,92 @@
     </w:p>
     <w:p>
       <w:r>
-        <w:t>            "mr_number": "",</w:t>
-      </w:r>
-    </w:p>
-    <w:p>
-      <w:r>
-        <w:t>            "pr_number": "",</w:t>
-      </w:r>
-    </w:p>
-    <w:p>
-      <w:r>
-        <w:t>            "assigned_date": "2021-09-06 11:04:04+06",</w:t>
-      </w:r>
-    </w:p>
-    <w:p>
-      <w:r>
-        <w:t>            "purchase_date": "",</w:t>
-      </w:r>
-    </w:p>
-    <w:p>
-      <w:r>
-        <w:t>            "warranty_date": "",</w:t>
+        <w:t>            "</w:t>
+      </w:r>
+      <w:proofErr w:type="spellStart"/>
+      <w:proofErr w:type="gramStart"/>
+      <w:r>
+        <w:t>mr</w:t>
+      </w:r>
+      <w:proofErr w:type="gramEnd"/>
+      <w:r>
+        <w:t>_number</w:t>
+      </w:r>
+      <w:proofErr w:type="spellEnd"/>
+      <w:r>
+        <w:t>": "",</w:t>
+      </w:r>
+    </w:p>
+    <w:p>
+      <w:r>
+        <w:t>            "</w:t>
+      </w:r>
+      <w:proofErr w:type="spellStart"/>
+      <w:proofErr w:type="gramStart"/>
+      <w:r>
+        <w:t>pr</w:t>
+      </w:r>
+      <w:proofErr w:type="gramEnd"/>
+      <w:r>
+        <w:t>_number</w:t>
+      </w:r>
+      <w:proofErr w:type="spellEnd"/>
+      <w:r>
+        <w:t>": "",</w:t>
+      </w:r>
+    </w:p>
+    <w:p>
+      <w:r>
+        <w:t>            "</w:t>
+      </w:r>
+      <w:proofErr w:type="spellStart"/>
+      <w:proofErr w:type="gramStart"/>
+      <w:r>
+        <w:t>assigned</w:t>
+      </w:r>
+      <w:proofErr w:type="gramEnd"/>
+      <w:r>
+        <w:t>_date</w:t>
+      </w:r>
+      <w:proofErr w:type="spellEnd"/>
+      <w:r>
+        <w:t>": "2021-09-06 11:04:04+06",</w:t>
+      </w:r>
+    </w:p>
+    <w:p>
+      <w:r>
+        <w:t>            "</w:t>
+      </w:r>
+      <w:proofErr w:type="spellStart"/>
+      <w:proofErr w:type="gramStart"/>
+      <w:r>
+        <w:t>purchase</w:t>
+      </w:r>
+      <w:proofErr w:type="gramEnd"/>
+      <w:r>
+        <w:t>_date</w:t>
+      </w:r>
+      <w:proofErr w:type="spellEnd"/>
+      <w:r>
+        <w:t>": "",</w:t>
+      </w:r>
+    </w:p>
+    <w:p>
+      <w:r>
+        <w:t>            "</w:t>
+      </w:r>
+      <w:proofErr w:type="spellStart"/>
+      <w:proofErr w:type="gramStart"/>
+      <w:r>
+        <w:t>warranty</w:t>
+      </w:r>
+      <w:proofErr w:type="gramEnd"/>
+      <w:r>
+        <w:t>_date</w:t>
+      </w:r>
+      <w:proofErr w:type="spellEnd"/>
+      <w:r>
+        <w:t>": "",</w:t>
       </w:r>
     </w:p>
     <w:p>
@@ -1074,7 +1798,20 @@
     </w:p>
     <w:p>
       <w:r>
-        <w:t>            "device_serial": "SE4130014",</w:t>
+        <w:t>            "</w:t>
+      </w:r>
+      <w:proofErr w:type="spellStart"/>
+      <w:proofErr w:type="gramStart"/>
+      <w:r>
+        <w:t>device</w:t>
+      </w:r>
+      <w:proofErr w:type="gramEnd"/>
+      <w:r>
+        <w:t>_serial</w:t>
+      </w:r>
+      <w:proofErr w:type="spellEnd"/>
+      <w:r>
+        <w:t>": "SE4130014",</w:t>
       </w:r>
     </w:p>
     <w:p>
@@ -1094,17 +1831,46 @@
     </w:p>
     <w:p>
       <w:r>
-        <w:t>            "employee_id": "02-0003",</w:t>
-      </w:r>
-    </w:p>
-    <w:p>
-      <w:r>
-        <w:t>            "employee_name": "Brig Gen Md. Rafiqur Rahman, psc (retd)",</w:t>
-      </w:r>
-    </w:p>
-    <w:p>
-      <w:r>
-        <w:t>            "department": "Implementation and Long Haul Operation",</w:t>
+        <w:t>            "</w:t>
+      </w:r>
+      <w:proofErr w:type="spellStart"/>
+      <w:proofErr w:type="gramStart"/>
+      <w:r>
+        <w:t>employee</w:t>
+      </w:r>
+      <w:proofErr w:type="gramEnd"/>
+      <w:r>
+        <w:t>_id</w:t>
+      </w:r>
+      <w:proofErr w:type="spellEnd"/>
+      <w:r>
+        <w:t>": "02-0003",</w:t>
+      </w:r>
+    </w:p>
+    <w:p>
+      <w:r>
+        <w:t>            "</w:t>
+      </w:r>
+      <w:proofErr w:type="gramStart"/>
+      <w:r>
+        <w:t>employee</w:t>
+      </w:r>
+      <w:proofErr w:type="gramEnd"/>
+      <w:r>
+        <w:t>_name": "Brig Gen Md. Rafiqur Rahman, psc (retd)",</w:t>
+      </w:r>
+    </w:p>
+    <w:p>
+      <w:r>
+        <w:t>            "department": "Implementation and </w:t>
+      </w:r>
+      <w:proofErr w:type="gramStart"/>
+      <w:r>
+        <w:t>Long Haul</w:t>
+      </w:r>
+      <w:proofErr w:type="gramEnd"/>
+      <w:r>
+        <w:t> Operation",</w:t>
       </w:r>
     </w:p>
     <w:p>
@@ -1114,27 +1880,92 @@
     </w:p>
     <w:p>
       <w:r>
-        <w:t>            "mr_number": "",</w:t>
-      </w:r>
-    </w:p>
-    <w:p>
-      <w:r>
-        <w:t>            "pr_number": "",</w:t>
-      </w:r>
-    </w:p>
-    <w:p>
-      <w:r>
-        <w:t>            "assigned_date": "2018-04-05 15:14:54+06",</w:t>
-      </w:r>
-    </w:p>
-    <w:p>
-      <w:r>
-        <w:t>            "purchase_date": "",</w:t>
-      </w:r>
-    </w:p>
-    <w:p>
-      <w:r>
-        <w:t>            "warranty_date": "",</w:t>
+        <w:t>            "</w:t>
+      </w:r>
+      <w:proofErr w:type="spellStart"/>
+      <w:proofErr w:type="gramStart"/>
+      <w:r>
+        <w:t>mr</w:t>
+      </w:r>
+      <w:proofErr w:type="gramEnd"/>
+      <w:r>
+        <w:t>_number</w:t>
+      </w:r>
+      <w:proofErr w:type="spellEnd"/>
+      <w:r>
+        <w:t>": "",</w:t>
+      </w:r>
+    </w:p>
+    <w:p>
+      <w:r>
+        <w:t>            "</w:t>
+      </w:r>
+      <w:proofErr w:type="spellStart"/>
+      <w:proofErr w:type="gramStart"/>
+      <w:r>
+        <w:t>pr</w:t>
+      </w:r>
+      <w:proofErr w:type="gramEnd"/>
+      <w:r>
+        <w:t>_number</w:t>
+      </w:r>
+      <w:proofErr w:type="spellEnd"/>
+      <w:r>
+        <w:t>": "",</w:t>
+      </w:r>
+    </w:p>
+    <w:p>
+      <w:r>
+        <w:t>            "</w:t>
+      </w:r>
+      <w:proofErr w:type="spellStart"/>
+      <w:proofErr w:type="gramStart"/>
+      <w:r>
+        <w:t>assigned</w:t>
+      </w:r>
+      <w:proofErr w:type="gramEnd"/>
+      <w:r>
+        <w:t>_date</w:t>
+      </w:r>
+      <w:proofErr w:type="spellEnd"/>
+      <w:r>
+        <w:t>": "2018-04-05 15:14:54+06",</w:t>
+      </w:r>
+    </w:p>
+    <w:p>
+      <w:r>
+        <w:t>            "</w:t>
+      </w:r>
+      <w:proofErr w:type="spellStart"/>
+      <w:proofErr w:type="gramStart"/>
+      <w:r>
+        <w:t>purchase</w:t>
+      </w:r>
+      <w:proofErr w:type="gramEnd"/>
+      <w:r>
+        <w:t>_date</w:t>
+      </w:r>
+      <w:proofErr w:type="spellEnd"/>
+      <w:r>
+        <w:t>": "",</w:t>
+      </w:r>
+    </w:p>
+    <w:p>
+      <w:r>
+        <w:t>            "</w:t>
+      </w:r>
+      <w:proofErr w:type="spellStart"/>
+      <w:proofErr w:type="gramStart"/>
+      <w:r>
+        <w:t>warranty</w:t>
+      </w:r>
+      <w:proofErr w:type="gramEnd"/>
+      <w:r>
+        <w:t>_date</w:t>
+      </w:r>
+      <w:proofErr w:type="spellEnd"/>
+      <w:r>
+        <w:t>": "",</w:t>
       </w:r>
     </w:p>
     <w:p>
@@ -1160,37 +1991,111 @@
     </w:p>
     <w:p>
       <w:r>
-        <w:t>            "device_serial": "JetFlash 700 16GB",</w:t>
-      </w:r>
-    </w:p>
-    <w:p>
-      <w:r>
-        <w:t>            "category": "PenDrive",</w:t>
-      </w:r>
-    </w:p>
-    <w:p>
-      <w:r>
-        <w:t>            "brand": "Transcdend",</w:t>
-      </w:r>
-    </w:p>
-    <w:p>
-      <w:r>
-        <w:t>            "model": "JetFlash 700",</w:t>
-      </w:r>
-    </w:p>
-    <w:p>
-      <w:r>
-        <w:t>            "employee_id": "02-0003",</w:t>
-      </w:r>
-    </w:p>
-    <w:p>
-      <w:r>
-        <w:t>            "employee_name": "Brig Gen Md. Rafiqur Rahman, psc (retd)",</w:t>
-      </w:r>
-    </w:p>
-    <w:p>
-      <w:r>
-        <w:t>            "department": "Implementation and Long Haul Operation",</w:t>
+        <w:t>            "</w:t>
+      </w:r>
+      <w:proofErr w:type="spellStart"/>
+      <w:proofErr w:type="gramStart"/>
+      <w:r>
+        <w:t>device</w:t>
+      </w:r>
+      <w:proofErr w:type="gramEnd"/>
+      <w:r>
+        <w:t>_serial</w:t>
+      </w:r>
+      <w:proofErr w:type="spellEnd"/>
+      <w:r>
+        <w:t>": "</w:t>
+      </w:r>
+      <w:proofErr w:type="spellStart"/>
+      <w:r>
+        <w:t>JetFlash</w:t>
+      </w:r>
+      <w:proofErr w:type="spellEnd"/>
+      <w:r>
+        <w:t> 700 16GB",</w:t>
+      </w:r>
+    </w:p>
+    <w:p>
+      <w:r>
+        <w:t>            "category": "</w:t>
+      </w:r>
+      <w:proofErr w:type="spellStart"/>
+      <w:r>
+        <w:t>PenDrive</w:t>
+      </w:r>
+      <w:proofErr w:type="spellEnd"/>
+      <w:r>
+        <w:t>",</w:t>
+      </w:r>
+    </w:p>
+    <w:p>
+      <w:r>
+        <w:t>            "brand": "</w:t>
+      </w:r>
+      <w:proofErr w:type="spellStart"/>
+      <w:r>
+        <w:t>Transcdend</w:t>
+      </w:r>
+      <w:proofErr w:type="spellEnd"/>
+      <w:r>
+        <w:t>",</w:t>
+      </w:r>
+    </w:p>
+    <w:p>
+      <w:r>
+        <w:t>            "model": "</w:t>
+      </w:r>
+      <w:proofErr w:type="spellStart"/>
+      <w:r>
+        <w:t>JetFlash</w:t>
+      </w:r>
+      <w:proofErr w:type="spellEnd"/>
+      <w:r>
+        <w:t> 700",</w:t>
+      </w:r>
+    </w:p>
+    <w:p>
+      <w:r>
+        <w:t>            "</w:t>
+      </w:r>
+      <w:proofErr w:type="spellStart"/>
+      <w:proofErr w:type="gramStart"/>
+      <w:r>
+        <w:t>employee</w:t>
+      </w:r>
+      <w:proofErr w:type="gramEnd"/>
+      <w:r>
+        <w:t>_id</w:t>
+      </w:r>
+      <w:proofErr w:type="spellEnd"/>
+      <w:r>
+        <w:t>": "02-0003",</w:t>
+      </w:r>
+    </w:p>
+    <w:p>
+      <w:r>
+        <w:t>            "</w:t>
+      </w:r>
+      <w:proofErr w:type="gramStart"/>
+      <w:r>
+        <w:t>employee</w:t>
+      </w:r>
+      <w:proofErr w:type="gramEnd"/>
+      <w:r>
+        <w:t>_name": "Brig Gen Md. Rafiqur Rahman, psc (retd)",</w:t>
+      </w:r>
+    </w:p>
+    <w:p>
+      <w:r>
+        <w:t>            "department": "Implementation and </w:t>
+      </w:r>
+      <w:proofErr w:type="gramStart"/>
+      <w:r>
+        <w:t>Long Haul</w:t>
+      </w:r>
+      <w:proofErr w:type="gramEnd"/>
+      <w:r>
+        <w:t> Operation",</w:t>
       </w:r>
     </w:p>
     <w:p>
@@ -1200,27 +2105,92 @@
     </w:p>
     <w:p>
       <w:r>
-        <w:t>            "mr_number": "",</w:t>
-      </w:r>
-    </w:p>
-    <w:p>
-      <w:r>
-        <w:t>            "pr_number": "FAHSC02090820170103PR3276",</w:t>
-      </w:r>
-    </w:p>
-    <w:p>
-      <w:r>
-        <w:t>            "assigned_date": "2017-10-26 15:12:38+06",</w:t>
-      </w:r>
-    </w:p>
-    <w:p>
-      <w:r>
-        <w:t>            "purchase_date": "",</w:t>
-      </w:r>
-    </w:p>
-    <w:p>
-      <w:r>
-        <w:t>            "warranty_date": "",</w:t>
+        <w:t>            "</w:t>
+      </w:r>
+      <w:proofErr w:type="spellStart"/>
+      <w:proofErr w:type="gramStart"/>
+      <w:r>
+        <w:t>mr</w:t>
+      </w:r>
+      <w:proofErr w:type="gramEnd"/>
+      <w:r>
+        <w:t>_number</w:t>
+      </w:r>
+      <w:proofErr w:type="spellEnd"/>
+      <w:r>
+        <w:t>": "",</w:t>
+      </w:r>
+    </w:p>
+    <w:p>
+      <w:r>
+        <w:t>            "</w:t>
+      </w:r>
+      <w:proofErr w:type="spellStart"/>
+      <w:proofErr w:type="gramStart"/>
+      <w:r>
+        <w:t>pr</w:t>
+      </w:r>
+      <w:proofErr w:type="gramEnd"/>
+      <w:r>
+        <w:t>_number</w:t>
+      </w:r>
+      <w:proofErr w:type="spellEnd"/>
+      <w:r>
+        <w:t>": "FAHSC02090820170103PR3276",</w:t>
+      </w:r>
+    </w:p>
+    <w:p>
+      <w:r>
+        <w:t>            "</w:t>
+      </w:r>
+      <w:proofErr w:type="spellStart"/>
+      <w:proofErr w:type="gramStart"/>
+      <w:r>
+        <w:t>assigned</w:t>
+      </w:r>
+      <w:proofErr w:type="gramEnd"/>
+      <w:r>
+        <w:t>_date</w:t>
+      </w:r>
+      <w:proofErr w:type="spellEnd"/>
+      <w:r>
+        <w:t>": "2017-10-26 15:12:38+06",</w:t>
+      </w:r>
+    </w:p>
+    <w:p>
+      <w:r>
+        <w:t>            "</w:t>
+      </w:r>
+      <w:proofErr w:type="spellStart"/>
+      <w:proofErr w:type="gramStart"/>
+      <w:r>
+        <w:t>purchase</w:t>
+      </w:r>
+      <w:proofErr w:type="gramEnd"/>
+      <w:r>
+        <w:t>_date</w:t>
+      </w:r>
+      <w:proofErr w:type="spellEnd"/>
+      <w:r>
+        <w:t>": "",</w:t>
+      </w:r>
+    </w:p>
+    <w:p>
+      <w:r>
+        <w:t>            "</w:t>
+      </w:r>
+      <w:proofErr w:type="spellStart"/>
+      <w:proofErr w:type="gramStart"/>
+      <w:r>
+        <w:t>warranty</w:t>
+      </w:r>
+      <w:proofErr w:type="gramEnd"/>
+      <w:r>
+        <w:t>_date</w:t>
+      </w:r>
+      <w:proofErr w:type="spellEnd"/>
+      <w:r>
+        <w:t>": "",</w:t>
       </w:r>
     </w:p>
     <w:p>
@@ -1245,7 +2215,20 @@
     </w:p>
     <w:p>
       <w:r>
-        <w:t>            "device_serial": "8CG4210S12",</w:t>
+        <w:t>            "</w:t>
+      </w:r>
+      <w:proofErr w:type="spellStart"/>
+      <w:proofErr w:type="gramStart"/>
+      <w:r>
+        <w:t>device</w:t>
+      </w:r>
+      <w:proofErr w:type="gramEnd"/>
+      <w:r>
+        <w:t>_serial</w:t>
+      </w:r>
+      <w:proofErr w:type="spellEnd"/>
+      <w:r>
+        <w:t>": "8CG4210S12",</w:t>
       </w:r>
     </w:p>
     <w:p>
@@ -1265,18 +2248,47 @@
     </w:p>
     <w:p>
       <w:r>
-        <w:t>            "employee_id": "02-0003",</w:t>
+        <w:t>            "</w:t>
+      </w:r>
+      <w:proofErr w:type="spellStart"/>
+      <w:proofErr w:type="gramStart"/>
+      <w:r>
+        <w:t>employee</w:t>
+      </w:r>
+      <w:proofErr w:type="gramEnd"/>
+      <w:r>
+        <w:t>_id</w:t>
+      </w:r>
+      <w:proofErr w:type="spellEnd"/>
+      <w:r>
+        <w:t>": "02-0003",</w:t>
       </w:r>
     </w:p>
     <w:p>
       <w:r>
         <w:lastRenderedPageBreak/>
-        <w:t>            "employee_name": "Brig Gen Md. Rafiqur Rahman, psc (retd)",</w:t>
-      </w:r>
-    </w:p>
-    <w:p>
-      <w:r>
-        <w:t>            "department": "Implementation and Long Haul Operation",</w:t>
+        <w:t>            "</w:t>
+      </w:r>
+      <w:proofErr w:type="gramStart"/>
+      <w:r>
+        <w:t>employee</w:t>
+      </w:r>
+      <w:proofErr w:type="gramEnd"/>
+      <w:r>
+        <w:t>_name": "Brig Gen Md. Rafiqur Rahman, psc (retd)",</w:t>
+      </w:r>
+    </w:p>
+    <w:p>
+      <w:r>
+        <w:t>            "department": "Implementation and </w:t>
+      </w:r>
+      <w:proofErr w:type="gramStart"/>
+      <w:r>
+        <w:t>Long Haul</w:t>
+      </w:r>
+      <w:proofErr w:type="gramEnd"/>
+      <w:r>
+        <w:t> Operation",</w:t>
       </w:r>
     </w:p>
     <w:p>
@@ -1286,27 +2298,92 @@
     </w:p>
     <w:p>
       <w:r>
-        <w:t>            "mr_number": "",</w:t>
-      </w:r>
-    </w:p>
-    <w:p>
-      <w:r>
-        <w:t>            "pr_number": "",</w:t>
-      </w:r>
-    </w:p>
-    <w:p>
-      <w:r>
-        <w:t>            "assigned_date": "",</w:t>
-      </w:r>
-    </w:p>
-    <w:p>
-      <w:r>
-        <w:t>            "purchase_date": "",</w:t>
-      </w:r>
-    </w:p>
-    <w:p>
-      <w:r>
-        <w:t>            "warranty_date": "",</w:t>
+        <w:t>            "</w:t>
+      </w:r>
+      <w:proofErr w:type="spellStart"/>
+      <w:proofErr w:type="gramStart"/>
+      <w:r>
+        <w:t>mr</w:t>
+      </w:r>
+      <w:proofErr w:type="gramEnd"/>
+      <w:r>
+        <w:t>_number</w:t>
+      </w:r>
+      <w:proofErr w:type="spellEnd"/>
+      <w:r>
+        <w:t>": "",</w:t>
+      </w:r>
+    </w:p>
+    <w:p>
+      <w:r>
+        <w:t>            "</w:t>
+      </w:r>
+      <w:proofErr w:type="spellStart"/>
+      <w:proofErr w:type="gramStart"/>
+      <w:r>
+        <w:t>pr</w:t>
+      </w:r>
+      <w:proofErr w:type="gramEnd"/>
+      <w:r>
+        <w:t>_number</w:t>
+      </w:r>
+      <w:proofErr w:type="spellEnd"/>
+      <w:r>
+        <w:t>": "",</w:t>
+      </w:r>
+    </w:p>
+    <w:p>
+      <w:r>
+        <w:t>            "</w:t>
+      </w:r>
+      <w:proofErr w:type="spellStart"/>
+      <w:proofErr w:type="gramStart"/>
+      <w:r>
+        <w:t>assigned</w:t>
+      </w:r>
+      <w:proofErr w:type="gramEnd"/>
+      <w:r>
+        <w:t>_date</w:t>
+      </w:r>
+      <w:proofErr w:type="spellEnd"/>
+      <w:r>
+        <w:t>": "",</w:t>
+      </w:r>
+    </w:p>
+    <w:p>
+      <w:r>
+        <w:t>            "</w:t>
+      </w:r>
+      <w:proofErr w:type="spellStart"/>
+      <w:proofErr w:type="gramStart"/>
+      <w:r>
+        <w:t>purchase</w:t>
+      </w:r>
+      <w:proofErr w:type="gramEnd"/>
+      <w:r>
+        <w:t>_date</w:t>
+      </w:r>
+      <w:proofErr w:type="spellEnd"/>
+      <w:r>
+        <w:t>": "",</w:t>
+      </w:r>
+    </w:p>
+    <w:p>
+      <w:r>
+        <w:t>            "</w:t>
+      </w:r>
+      <w:proofErr w:type="spellStart"/>
+      <w:proofErr w:type="gramStart"/>
+      <w:r>
+        <w:t>warranty</w:t>
+      </w:r>
+      <w:proofErr w:type="gramEnd"/>
+      <w:r>
+        <w:t>_date</w:t>
+      </w:r>
+      <w:proofErr w:type="spellEnd"/>
+      <w:r>
+        <w:t>": "",</w:t>
       </w:r>
     </w:p>
     <w:p>
@@ -1331,7 +2408,20 @@
     </w:p>
     <w:p>
       <w:r>
-        <w:t>    "page_size": 20,</w:t>
+        <w:t>    "</w:t>
+      </w:r>
+      <w:proofErr w:type="spellStart"/>
+      <w:proofErr w:type="gramStart"/>
+      <w:r>
+        <w:t>page</w:t>
+      </w:r>
+      <w:proofErr w:type="gramEnd"/>
+      <w:r>
+        <w:t>_size</w:t>
+      </w:r>
+      <w:proofErr w:type="spellEnd"/>
+      <w:r>
+        <w:t>": 20,</w:t>
       </w:r>
     </w:p>
     <w:p>
@@ -1405,7 +2495,20 @@
     </w:p>
     <w:p>
       <w:r>
-        <w:t>            "device_serial": "3CM3370FYR",</w:t>
+        <w:t>            "</w:t>
+      </w:r>
+      <w:proofErr w:type="spellStart"/>
+      <w:proofErr w:type="gramStart"/>
+      <w:r>
+        <w:t>device</w:t>
+      </w:r>
+      <w:proofErr w:type="gramEnd"/>
+      <w:r>
+        <w:t>_serial</w:t>
+      </w:r>
+      <w:proofErr w:type="spellEnd"/>
+      <w:r>
+        <w:t>": "3CM3370FYR",</w:t>
       </w:r>
     </w:p>
     <w:p>
@@ -1425,12 +2528,38 @@
     </w:p>
     <w:p>
       <w:r>
-        <w:t>            "employee_id": "02-0016",</w:t>
-      </w:r>
-    </w:p>
-    <w:p>
-      <w:r>
-        <w:t>            "employee_name": "Abbas Faruque",</w:t>
+        <w:t>            "</w:t>
+      </w:r>
+      <w:proofErr w:type="spellStart"/>
+      <w:proofErr w:type="gramStart"/>
+      <w:r>
+        <w:t>employee</w:t>
+      </w:r>
+      <w:proofErr w:type="gramEnd"/>
+      <w:r>
+        <w:t>_id</w:t>
+      </w:r>
+      <w:proofErr w:type="spellEnd"/>
+      <w:r>
+        <w:t>": "02-0016",</w:t>
+      </w:r>
+    </w:p>
+    <w:p>
+      <w:r>
+        <w:t>            "</w:t>
+      </w:r>
+      <w:proofErr w:type="spellStart"/>
+      <w:proofErr w:type="gramStart"/>
+      <w:r>
+        <w:t>employee</w:t>
+      </w:r>
+      <w:proofErr w:type="gramEnd"/>
+      <w:r>
+        <w:t>_name</w:t>
+      </w:r>
+      <w:proofErr w:type="spellEnd"/>
+      <w:r>
+        <w:t>": "Abbas Faruque",</w:t>
       </w:r>
     </w:p>
     <w:p>
@@ -1450,32 +2579,110 @@
     </w:p>
     <w:p>
       <w:r>
-        <w:t>            "tier_level": 1,</w:t>
-      </w:r>
-    </w:p>
-    <w:p>
-      <w:r>
-        <w:t>            "mr_number": "",</w:t>
-      </w:r>
-    </w:p>
-    <w:p>
-      <w:r>
-        <w:t>            "pr_number": "FAHSC02-22972024-07-29PR12410",</w:t>
-      </w:r>
-    </w:p>
-    <w:p>
-      <w:r>
-        <w:t>            "assigned_date": "2024-08-25 14:50:39+06",</w:t>
-      </w:r>
-    </w:p>
-    <w:p>
-      <w:r>
-        <w:t>            "purchase_date": "",</w:t>
-      </w:r>
-    </w:p>
-    <w:p>
-      <w:r>
-        <w:t>            "warranty_date": "2027-08-25 14:50:40+06",</w:t>
+        <w:t>            "</w:t>
+      </w:r>
+      <w:proofErr w:type="spellStart"/>
+      <w:proofErr w:type="gramStart"/>
+      <w:r>
+        <w:t>tier</w:t>
+      </w:r>
+      <w:proofErr w:type="gramEnd"/>
+      <w:r>
+        <w:t>_level</w:t>
+      </w:r>
+      <w:proofErr w:type="spellEnd"/>
+      <w:r>
+        <w:t>": 1,</w:t>
+      </w:r>
+    </w:p>
+    <w:p>
+      <w:r>
+        <w:t>            "</w:t>
+      </w:r>
+      <w:proofErr w:type="spellStart"/>
+      <w:proofErr w:type="gramStart"/>
+      <w:r>
+        <w:t>mr</w:t>
+      </w:r>
+      <w:proofErr w:type="gramEnd"/>
+      <w:r>
+        <w:t>_number</w:t>
+      </w:r>
+      <w:proofErr w:type="spellEnd"/>
+      <w:r>
+        <w:t>": "",</w:t>
+      </w:r>
+    </w:p>
+    <w:p>
+      <w:r>
+        <w:t>            "</w:t>
+      </w:r>
+      <w:proofErr w:type="spellStart"/>
+      <w:proofErr w:type="gramStart"/>
+      <w:r>
+        <w:t>pr</w:t>
+      </w:r>
+      <w:proofErr w:type="gramEnd"/>
+      <w:r>
+        <w:t>_number</w:t>
+      </w:r>
+      <w:proofErr w:type="spellEnd"/>
+      <w:r>
+        <w:t>": "FAHSC02-22972024-07-29PR12410",</w:t>
+      </w:r>
+    </w:p>
+    <w:p>
+      <w:r>
+        <w:t>            "</w:t>
+      </w:r>
+      <w:proofErr w:type="spellStart"/>
+      <w:proofErr w:type="gramStart"/>
+      <w:r>
+        <w:t>assigned</w:t>
+      </w:r>
+      <w:proofErr w:type="gramEnd"/>
+      <w:r>
+        <w:t>_date</w:t>
+      </w:r>
+      <w:proofErr w:type="spellEnd"/>
+      <w:r>
+        <w:t>": "2024-08-25 14:50:39+06",</w:t>
+      </w:r>
+    </w:p>
+    <w:p>
+      <w:r>
+        <w:t>            "</w:t>
+      </w:r>
+      <w:proofErr w:type="spellStart"/>
+      <w:proofErr w:type="gramStart"/>
+      <w:r>
+        <w:t>purchase</w:t>
+      </w:r>
+      <w:proofErr w:type="gramEnd"/>
+      <w:r>
+        <w:t>_date</w:t>
+      </w:r>
+      <w:proofErr w:type="spellEnd"/>
+      <w:r>
+        <w:t>": "",</w:t>
+      </w:r>
+    </w:p>
+    <w:p>
+      <w:r>
+        <w:t>            "</w:t>
+      </w:r>
+      <w:proofErr w:type="spellStart"/>
+      <w:proofErr w:type="gramStart"/>
+      <w:r>
+        <w:t>warranty</w:t>
+      </w:r>
+      <w:proofErr w:type="gramEnd"/>
+      <w:r>
+        <w:t>_date</w:t>
+      </w:r>
+      <w:proofErr w:type="spellEnd"/>
+      <w:r>
+        <w:t>": "2027-08-25 14:50:40+06",</w:t>
       </w:r>
     </w:p>
     <w:p>
@@ -1501,7 +2708,20 @@
     </w:p>
     <w:p>
       <w:r>
-        <w:t>            "device_serial": "2216LZ91BTN9",</w:t>
+        <w:t>            "</w:t>
+      </w:r>
+      <w:proofErr w:type="spellStart"/>
+      <w:proofErr w:type="gramStart"/>
+      <w:r>
+        <w:t>device</w:t>
+      </w:r>
+      <w:proofErr w:type="gramEnd"/>
+      <w:r>
+        <w:t>_serial</w:t>
+      </w:r>
+      <w:proofErr w:type="spellEnd"/>
+      <w:r>
+        <w:t>": "2216LZ91BTN9",</w:t>
       </w:r>
     </w:p>
     <w:p>
@@ -1521,12 +2741,38 @@
     </w:p>
     <w:p>
       <w:r>
-        <w:t>            "employee_id": "02-0016",</w:t>
-      </w:r>
-    </w:p>
-    <w:p>
-      <w:r>
-        <w:t>            "employee_name": "Abbas Faruque",</w:t>
+        <w:t>            "</w:t>
+      </w:r>
+      <w:proofErr w:type="spellStart"/>
+      <w:proofErr w:type="gramStart"/>
+      <w:r>
+        <w:t>employee</w:t>
+      </w:r>
+      <w:proofErr w:type="gramEnd"/>
+      <w:r>
+        <w:t>_id</w:t>
+      </w:r>
+      <w:proofErr w:type="spellEnd"/>
+      <w:r>
+        <w:t>": "02-0016",</w:t>
+      </w:r>
+    </w:p>
+    <w:p>
+      <w:r>
+        <w:t>            "</w:t>
+      </w:r>
+      <w:proofErr w:type="spellStart"/>
+      <w:proofErr w:type="gramStart"/>
+      <w:r>
+        <w:t>employee</w:t>
+      </w:r>
+      <w:proofErr w:type="gramEnd"/>
+      <w:r>
+        <w:t>_name</w:t>
+      </w:r>
+      <w:proofErr w:type="spellEnd"/>
+      <w:r>
+        <w:t>": "Abbas Faruque",</w:t>
       </w:r>
     </w:p>
     <w:p>
@@ -1546,32 +2792,110 @@
     </w:p>
     <w:p>
       <w:r>
-        <w:t>            "tier_level": 1,</w:t>
-      </w:r>
-    </w:p>
-    <w:p>
-      <w:r>
-        <w:t>            "mr_number": "",</w:t>
-      </w:r>
-    </w:p>
-    <w:p>
-      <w:r>
-        <w:t>            "pr_number": "FAHSC02-01862023-02-08PR10756",</w:t>
-      </w:r>
-    </w:p>
-    <w:p>
-      <w:r>
-        <w:t>            "assigned_date": "2023-10-23 16:50:32+06",</w:t>
-      </w:r>
-    </w:p>
-    <w:p>
-      <w:r>
-        <w:t>            "purchase_date": "",</w:t>
-      </w:r>
-    </w:p>
-    <w:p>
-      <w:r>
-        <w:t>            "warranty_date": "",</w:t>
+        <w:t>            "</w:t>
+      </w:r>
+      <w:proofErr w:type="spellStart"/>
+      <w:proofErr w:type="gramStart"/>
+      <w:r>
+        <w:t>tier</w:t>
+      </w:r>
+      <w:proofErr w:type="gramEnd"/>
+      <w:r>
+        <w:t>_level</w:t>
+      </w:r>
+      <w:proofErr w:type="spellEnd"/>
+      <w:r>
+        <w:t>": 1,</w:t>
+      </w:r>
+    </w:p>
+    <w:p>
+      <w:r>
+        <w:t>            "</w:t>
+      </w:r>
+      <w:proofErr w:type="spellStart"/>
+      <w:proofErr w:type="gramStart"/>
+      <w:r>
+        <w:t>mr</w:t>
+      </w:r>
+      <w:proofErr w:type="gramEnd"/>
+      <w:r>
+        <w:t>_number</w:t>
+      </w:r>
+      <w:proofErr w:type="spellEnd"/>
+      <w:r>
+        <w:t>": "",</w:t>
+      </w:r>
+    </w:p>
+    <w:p>
+      <w:r>
+        <w:t>            "</w:t>
+      </w:r>
+      <w:proofErr w:type="spellStart"/>
+      <w:proofErr w:type="gramStart"/>
+      <w:r>
+        <w:t>pr</w:t>
+      </w:r>
+      <w:proofErr w:type="gramEnd"/>
+      <w:r>
+        <w:t>_number</w:t>
+      </w:r>
+      <w:proofErr w:type="spellEnd"/>
+      <w:r>
+        <w:t>": "FAHSC02-01862023-02-08PR10756",</w:t>
+      </w:r>
+    </w:p>
+    <w:p>
+      <w:r>
+        <w:t>            "</w:t>
+      </w:r>
+      <w:proofErr w:type="spellStart"/>
+      <w:proofErr w:type="gramStart"/>
+      <w:r>
+        <w:t>assigned</w:t>
+      </w:r>
+      <w:proofErr w:type="gramEnd"/>
+      <w:r>
+        <w:t>_date</w:t>
+      </w:r>
+      <w:proofErr w:type="spellEnd"/>
+      <w:r>
+        <w:t>": "2023-10-23 16:50:32+06",</w:t>
+      </w:r>
+    </w:p>
+    <w:p>
+      <w:r>
+        <w:t>            "</w:t>
+      </w:r>
+      <w:proofErr w:type="spellStart"/>
+      <w:proofErr w:type="gramStart"/>
+      <w:r>
+        <w:t>purchase</w:t>
+      </w:r>
+      <w:proofErr w:type="gramEnd"/>
+      <w:r>
+        <w:t>_date</w:t>
+      </w:r>
+      <w:proofErr w:type="spellEnd"/>
+      <w:r>
+        <w:t>": "",</w:t>
+      </w:r>
+    </w:p>
+    <w:p>
+      <w:r>
+        <w:t>            "</w:t>
+      </w:r>
+      <w:proofErr w:type="spellStart"/>
+      <w:proofErr w:type="gramStart"/>
+      <w:r>
+        <w:t>warranty</w:t>
+      </w:r>
+      <w:proofErr w:type="gramEnd"/>
+      <w:r>
+        <w:t>_date</w:t>
+      </w:r>
+      <w:proofErr w:type="spellEnd"/>
+      <w:r>
+        <w:t>": "",</w:t>
       </w:r>
     </w:p>
     <w:p>
@@ -1596,7 +2920,20 @@
     </w:p>
     <w:p>
       <w:r>
-        <w:t>            "device_serial": "5CD201K569",</w:t>
+        <w:t>            "</w:t>
+      </w:r>
+      <w:proofErr w:type="spellStart"/>
+      <w:proofErr w:type="gramStart"/>
+      <w:r>
+        <w:t>device</w:t>
+      </w:r>
+      <w:proofErr w:type="gramEnd"/>
+      <w:r>
+        <w:t>_serial</w:t>
+      </w:r>
+      <w:proofErr w:type="spellEnd"/>
+      <w:r>
+        <w:t>": "5CD201K569",</w:t>
       </w:r>
     </w:p>
     <w:p>
@@ -1616,13 +2953,39 @@
     </w:p>
     <w:p>
       <w:r>
-        <w:t>            "employee_id": "02-0016",</w:t>
+        <w:t>            "</w:t>
+      </w:r>
+      <w:proofErr w:type="spellStart"/>
+      <w:proofErr w:type="gramStart"/>
+      <w:r>
+        <w:t>employee</w:t>
+      </w:r>
+      <w:proofErr w:type="gramEnd"/>
+      <w:r>
+        <w:t>_id</w:t>
+      </w:r>
+      <w:proofErr w:type="spellEnd"/>
+      <w:r>
+        <w:t>": "02-0016",</w:t>
       </w:r>
     </w:p>
     <w:p>
       <w:r>
         <w:lastRenderedPageBreak/>
-        <w:t>            "employee_name": "Abbas Faruque",</w:t>
+        <w:t>            "</w:t>
+      </w:r>
+      <w:proofErr w:type="spellStart"/>
+      <w:proofErr w:type="gramStart"/>
+      <w:r>
+        <w:t>employee</w:t>
+      </w:r>
+      <w:proofErr w:type="gramEnd"/>
+      <w:r>
+        <w:t>_name</w:t>
+      </w:r>
+      <w:proofErr w:type="spellEnd"/>
+      <w:r>
+        <w:t>": "Abbas Faruque",</w:t>
       </w:r>
     </w:p>
     <w:p>
@@ -1642,32 +3005,110 @@
     </w:p>
     <w:p>
       <w:r>
-        <w:t>            "tier_level": 1,</w:t>
-      </w:r>
-    </w:p>
-    <w:p>
-      <w:r>
-        <w:t>            "mr_number": "",</w:t>
-      </w:r>
-    </w:p>
-    <w:p>
-      <w:r>
-        <w:t>            "pr_number": "FAHSC2022-04-21PO6145",</w:t>
-      </w:r>
-    </w:p>
-    <w:p>
-      <w:r>
-        <w:t>            "assigned_date": "2022-09-04 13:07:43+06",</w:t>
-      </w:r>
-    </w:p>
-    <w:p>
-      <w:r>
-        <w:t>            "purchase_date": "",</w:t>
-      </w:r>
-    </w:p>
-    <w:p>
-      <w:r>
-        <w:t>            "warranty_date": "",</w:t>
+        <w:t>            "</w:t>
+      </w:r>
+      <w:proofErr w:type="spellStart"/>
+      <w:proofErr w:type="gramStart"/>
+      <w:r>
+        <w:t>tier</w:t>
+      </w:r>
+      <w:proofErr w:type="gramEnd"/>
+      <w:r>
+        <w:t>_level</w:t>
+      </w:r>
+      <w:proofErr w:type="spellEnd"/>
+      <w:r>
+        <w:t>": 1,</w:t>
+      </w:r>
+    </w:p>
+    <w:p>
+      <w:r>
+        <w:t>            "</w:t>
+      </w:r>
+      <w:proofErr w:type="spellStart"/>
+      <w:proofErr w:type="gramStart"/>
+      <w:r>
+        <w:t>mr</w:t>
+      </w:r>
+      <w:proofErr w:type="gramEnd"/>
+      <w:r>
+        <w:t>_number</w:t>
+      </w:r>
+      <w:proofErr w:type="spellEnd"/>
+      <w:r>
+        <w:t>": "",</w:t>
+      </w:r>
+    </w:p>
+    <w:p>
+      <w:r>
+        <w:t>            "</w:t>
+      </w:r>
+      <w:proofErr w:type="spellStart"/>
+      <w:proofErr w:type="gramStart"/>
+      <w:r>
+        <w:t>pr</w:t>
+      </w:r>
+      <w:proofErr w:type="gramEnd"/>
+      <w:r>
+        <w:t>_number</w:t>
+      </w:r>
+      <w:proofErr w:type="spellEnd"/>
+      <w:r>
+        <w:t>": "FAHSC2022-04-21PO6145",</w:t>
+      </w:r>
+    </w:p>
+    <w:p>
+      <w:r>
+        <w:t>            "</w:t>
+      </w:r>
+      <w:proofErr w:type="spellStart"/>
+      <w:proofErr w:type="gramStart"/>
+      <w:r>
+        <w:t>assigned</w:t>
+      </w:r>
+      <w:proofErr w:type="gramEnd"/>
+      <w:r>
+        <w:t>_date</w:t>
+      </w:r>
+      <w:proofErr w:type="spellEnd"/>
+      <w:r>
+        <w:t>": "2022-09-04 13:07:43+06",</w:t>
+      </w:r>
+    </w:p>
+    <w:p>
+      <w:r>
+        <w:t>            "</w:t>
+      </w:r>
+      <w:proofErr w:type="spellStart"/>
+      <w:proofErr w:type="gramStart"/>
+      <w:r>
+        <w:t>purchase</w:t>
+      </w:r>
+      <w:proofErr w:type="gramEnd"/>
+      <w:r>
+        <w:t>_date</w:t>
+      </w:r>
+      <w:proofErr w:type="spellEnd"/>
+      <w:r>
+        <w:t>": "",</w:t>
+      </w:r>
+    </w:p>
+    <w:p>
+      <w:r>
+        <w:t>            "</w:t>
+      </w:r>
+      <w:proofErr w:type="spellStart"/>
+      <w:proofErr w:type="gramStart"/>
+      <w:r>
+        <w:t>warranty</w:t>
+      </w:r>
+      <w:proofErr w:type="gramEnd"/>
+      <w:r>
+        <w:t>_date</w:t>
+      </w:r>
+      <w:proofErr w:type="spellEnd"/>
+      <w:r>
+        <w:t>": "",</w:t>
       </w:r>
     </w:p>
     <w:p>
@@ -1692,7 +3133,20 @@
     </w:p>
     <w:p>
       <w:r>
-        <w:t>            "device_serial": "cnd4357wf1",</w:t>
+        <w:t>            "</w:t>
+      </w:r>
+      <w:proofErr w:type="spellStart"/>
+      <w:proofErr w:type="gramStart"/>
+      <w:r>
+        <w:t>device</w:t>
+      </w:r>
+      <w:proofErr w:type="gramEnd"/>
+      <w:r>
+        <w:t>_serial</w:t>
+      </w:r>
+      <w:proofErr w:type="spellEnd"/>
+      <w:r>
+        <w:t>": "cnd4357wf1",</w:t>
       </w:r>
     </w:p>
     <w:p>
@@ -1707,17 +3161,51 @@
     </w:p>
     <w:p>
       <w:r>
-        <w:t>            "model": "probook 440 g2",</w:t>
-      </w:r>
-    </w:p>
-    <w:p>
-      <w:r>
-        <w:t>            "employee_id": "02-0016",</w:t>
-      </w:r>
-    </w:p>
-    <w:p>
-      <w:r>
-        <w:t>            "employee_name": "Abbas Faruque",</w:t>
+        <w:t>            "model": "</w:t>
+      </w:r>
+      <w:proofErr w:type="spellStart"/>
+      <w:r>
+        <w:t>probook</w:t>
+      </w:r>
+      <w:proofErr w:type="spellEnd"/>
+      <w:r>
+        <w:t> 440 g2",</w:t>
+      </w:r>
+    </w:p>
+    <w:p>
+      <w:r>
+        <w:t>            "</w:t>
+      </w:r>
+      <w:proofErr w:type="spellStart"/>
+      <w:proofErr w:type="gramStart"/>
+      <w:r>
+        <w:t>employee</w:t>
+      </w:r>
+      <w:proofErr w:type="gramEnd"/>
+      <w:r>
+        <w:t>_id</w:t>
+      </w:r>
+      <w:proofErr w:type="spellEnd"/>
+      <w:r>
+        <w:t>": "02-0016",</w:t>
+      </w:r>
+    </w:p>
+    <w:p>
+      <w:r>
+        <w:t>            "</w:t>
+      </w:r>
+      <w:proofErr w:type="spellStart"/>
+      <w:proofErr w:type="gramStart"/>
+      <w:r>
+        <w:t>employee</w:t>
+      </w:r>
+      <w:proofErr w:type="gramEnd"/>
+      <w:r>
+        <w:t>_name</w:t>
+      </w:r>
+      <w:proofErr w:type="spellEnd"/>
+      <w:r>
+        <w:t>": "Abbas Faruque",</w:t>
       </w:r>
     </w:p>
     <w:p>
@@ -1737,33 +3225,111 @@
     </w:p>
     <w:p>
       <w:r>
-        <w:t>            "tier_level": 1,</w:t>
-      </w:r>
-    </w:p>
-    <w:p>
-      <w:r>
-        <w:t>            "mr_number": "",</w:t>
-      </w:r>
-    </w:p>
-    <w:p>
-      <w:r>
-        <w:t>            "pr_number": "",</w:t>
+        <w:t>            "</w:t>
+      </w:r>
+      <w:proofErr w:type="spellStart"/>
+      <w:proofErr w:type="gramStart"/>
+      <w:r>
+        <w:t>tier</w:t>
+      </w:r>
+      <w:proofErr w:type="gramEnd"/>
+      <w:r>
+        <w:t>_level</w:t>
+      </w:r>
+      <w:proofErr w:type="spellEnd"/>
+      <w:r>
+        <w:t>": 1,</w:t>
+      </w:r>
+    </w:p>
+    <w:p>
+      <w:r>
+        <w:t>            "</w:t>
+      </w:r>
+      <w:proofErr w:type="spellStart"/>
+      <w:proofErr w:type="gramStart"/>
+      <w:r>
+        <w:t>mr</w:t>
+      </w:r>
+      <w:proofErr w:type="gramEnd"/>
+      <w:r>
+        <w:t>_number</w:t>
+      </w:r>
+      <w:proofErr w:type="spellEnd"/>
+      <w:r>
+        <w:t>": "",</w:t>
+      </w:r>
+    </w:p>
+    <w:p>
+      <w:r>
+        <w:t>            "</w:t>
+      </w:r>
+      <w:proofErr w:type="spellStart"/>
+      <w:proofErr w:type="gramStart"/>
+      <w:r>
+        <w:t>pr</w:t>
+      </w:r>
+      <w:proofErr w:type="gramEnd"/>
+      <w:r>
+        <w:t>_number</w:t>
+      </w:r>
+      <w:proofErr w:type="spellEnd"/>
+      <w:r>
+        <w:t>": "",</w:t>
       </w:r>
     </w:p>
     <w:p>
       <w:r>
         <w:lastRenderedPageBreak/>
-        <w:t>            "assigned_date": "",</w:t>
-      </w:r>
-    </w:p>
-    <w:p>
-      <w:r>
-        <w:t>            "purchase_date": "",</w:t>
-      </w:r>
-    </w:p>
-    <w:p>
-      <w:r>
-        <w:t>            "warranty_date": "",</w:t>
+        <w:t>            "</w:t>
+      </w:r>
+      <w:proofErr w:type="spellStart"/>
+      <w:proofErr w:type="gramStart"/>
+      <w:r>
+        <w:t>assigned</w:t>
+      </w:r>
+      <w:proofErr w:type="gramEnd"/>
+      <w:r>
+        <w:t>_date</w:t>
+      </w:r>
+      <w:proofErr w:type="spellEnd"/>
+      <w:r>
+        <w:t>": "",</w:t>
+      </w:r>
+    </w:p>
+    <w:p>
+      <w:r>
+        <w:t>            "</w:t>
+      </w:r>
+      <w:proofErr w:type="spellStart"/>
+      <w:proofErr w:type="gramStart"/>
+      <w:r>
+        <w:t>purchase</w:t>
+      </w:r>
+      <w:proofErr w:type="gramEnd"/>
+      <w:r>
+        <w:t>_date</w:t>
+      </w:r>
+      <w:proofErr w:type="spellEnd"/>
+      <w:r>
+        <w:t>": "",</w:t>
+      </w:r>
+    </w:p>
+    <w:p>
+      <w:r>
+        <w:t>            "</w:t>
+      </w:r>
+      <w:proofErr w:type="spellStart"/>
+      <w:proofErr w:type="gramStart"/>
+      <w:r>
+        <w:t>warranty</w:t>
+      </w:r>
+      <w:proofErr w:type="gramEnd"/>
+      <w:r>
+        <w:t>_date</w:t>
+      </w:r>
+      <w:proofErr w:type="spellEnd"/>
+      <w:r>
+        <w:t>": "",</w:t>
       </w:r>
     </w:p>
     <w:p>
@@ -1788,7 +3354,20 @@
     </w:p>
     <w:p>
       <w:r>
-        <w:t>            "device_serial": "X011ZLD224RX5T",</w:t>
+        <w:t>            "</w:t>
+      </w:r>
+      <w:proofErr w:type="spellStart"/>
+      <w:proofErr w:type="gramStart"/>
+      <w:r>
+        <w:t>device</w:t>
+      </w:r>
+      <w:proofErr w:type="gramEnd"/>
+      <w:r>
+        <w:t>_serial</w:t>
+      </w:r>
+      <w:proofErr w:type="spellEnd"/>
+      <w:r>
+        <w:t>": "X011ZLD224RX5T",</w:t>
       </w:r>
     </w:p>
     <w:p>
@@ -1808,12 +3387,38 @@
     </w:p>
     <w:p>
       <w:r>
-        <w:t>            "employee_id": "02-1267",</w:t>
-      </w:r>
-    </w:p>
-    <w:p>
-      <w:r>
-        <w:t>            "employee_name": "Arifur Rahman",</w:t>
+        <w:t>            "</w:t>
+      </w:r>
+      <w:proofErr w:type="spellStart"/>
+      <w:proofErr w:type="gramStart"/>
+      <w:r>
+        <w:t>employee</w:t>
+      </w:r>
+      <w:proofErr w:type="gramEnd"/>
+      <w:r>
+        <w:t>_id</w:t>
+      </w:r>
+      <w:proofErr w:type="spellEnd"/>
+      <w:r>
+        <w:t>": "02-1267",</w:t>
+      </w:r>
+    </w:p>
+    <w:p>
+      <w:r>
+        <w:t>            "</w:t>
+      </w:r>
+      <w:proofErr w:type="spellStart"/>
+      <w:proofErr w:type="gramStart"/>
+      <w:r>
+        <w:t>employee</w:t>
+      </w:r>
+      <w:proofErr w:type="gramEnd"/>
+      <w:r>
+        <w:t>_name</w:t>
+      </w:r>
+      <w:proofErr w:type="spellEnd"/>
+      <w:r>
+        <w:t>": "Arifur Rahman",</w:t>
       </w:r>
     </w:p>
     <w:p>
@@ -1833,32 +3438,110 @@
     </w:p>
     <w:p>
       <w:r>
-        <w:t>            "tier_level": 1,</w:t>
-      </w:r>
-    </w:p>
-    <w:p>
-      <w:r>
-        <w:t>            "mr_number": "",</w:t>
-      </w:r>
-    </w:p>
-    <w:p>
-      <w:r>
-        <w:t>            "pr_number": "PETTY CASH",</w:t>
-      </w:r>
-    </w:p>
-    <w:p>
-      <w:r>
-        <w:t>            "assigned_date": "2018-07-02 16:13:07+06",</w:t>
-      </w:r>
-    </w:p>
-    <w:p>
-      <w:r>
-        <w:t>            "purchase_date": "",</w:t>
-      </w:r>
-    </w:p>
-    <w:p>
-      <w:r>
-        <w:t>            "warranty_date": "",</w:t>
+        <w:t>            "</w:t>
+      </w:r>
+      <w:proofErr w:type="spellStart"/>
+      <w:proofErr w:type="gramStart"/>
+      <w:r>
+        <w:t>tier</w:t>
+      </w:r>
+      <w:proofErr w:type="gramEnd"/>
+      <w:r>
+        <w:t>_level</w:t>
+      </w:r>
+      <w:proofErr w:type="spellEnd"/>
+      <w:r>
+        <w:t>": 1,</w:t>
+      </w:r>
+    </w:p>
+    <w:p>
+      <w:r>
+        <w:t>            "</w:t>
+      </w:r>
+      <w:proofErr w:type="spellStart"/>
+      <w:proofErr w:type="gramStart"/>
+      <w:r>
+        <w:t>mr</w:t>
+      </w:r>
+      <w:proofErr w:type="gramEnd"/>
+      <w:r>
+        <w:t>_number</w:t>
+      </w:r>
+      <w:proofErr w:type="spellEnd"/>
+      <w:r>
+        <w:t>": "",</w:t>
+      </w:r>
+    </w:p>
+    <w:p>
+      <w:r>
+        <w:t>            "</w:t>
+      </w:r>
+      <w:proofErr w:type="spellStart"/>
+      <w:proofErr w:type="gramStart"/>
+      <w:r>
+        <w:t>pr</w:t>
+      </w:r>
+      <w:proofErr w:type="gramEnd"/>
+      <w:r>
+        <w:t>_number</w:t>
+      </w:r>
+      <w:proofErr w:type="spellEnd"/>
+      <w:r>
+        <w:t>": "PETTY CASH",</w:t>
+      </w:r>
+    </w:p>
+    <w:p>
+      <w:r>
+        <w:t>            "</w:t>
+      </w:r>
+      <w:proofErr w:type="spellStart"/>
+      <w:proofErr w:type="gramStart"/>
+      <w:r>
+        <w:t>assigned</w:t>
+      </w:r>
+      <w:proofErr w:type="gramEnd"/>
+      <w:r>
+        <w:t>_date</w:t>
+      </w:r>
+      <w:proofErr w:type="spellEnd"/>
+      <w:r>
+        <w:t>": "2018-07-02 16:13:07+06",</w:t>
+      </w:r>
+    </w:p>
+    <w:p>
+      <w:r>
+        <w:t>            "</w:t>
+      </w:r>
+      <w:proofErr w:type="spellStart"/>
+      <w:proofErr w:type="gramStart"/>
+      <w:r>
+        <w:t>purchase</w:t>
+      </w:r>
+      <w:proofErr w:type="gramEnd"/>
+      <w:r>
+        <w:t>_date</w:t>
+      </w:r>
+      <w:proofErr w:type="spellEnd"/>
+      <w:r>
+        <w:t>": "",</w:t>
+      </w:r>
+    </w:p>
+    <w:p>
+      <w:r>
+        <w:t>            "</w:t>
+      </w:r>
+      <w:proofErr w:type="spellStart"/>
+      <w:proofErr w:type="gramStart"/>
+      <w:r>
+        <w:t>warranty</w:t>
+      </w:r>
+      <w:proofErr w:type="gramEnd"/>
+      <w:r>
+        <w:t>_date</w:t>
+      </w:r>
+      <w:proofErr w:type="spellEnd"/>
+      <w:r>
+        <w:t>": "",</w:t>
       </w:r>
     </w:p>
     <w:p>
@@ -1887,7 +3570,20 @@
     </w:p>
     <w:p>
       <w:r>
-        <w:t>            "device_serial": "2532APJLDWH8",</w:t>
+        <w:t>            "</w:t>
+      </w:r>
+      <w:proofErr w:type="spellStart"/>
+      <w:proofErr w:type="gramStart"/>
+      <w:r>
+        <w:t>device</w:t>
+      </w:r>
+      <w:proofErr w:type="gramEnd"/>
+      <w:r>
+        <w:t>_serial</w:t>
+      </w:r>
+      <w:proofErr w:type="spellEnd"/>
+      <w:r>
+        <w:t>": "2532APJLDWH8",</w:t>
       </w:r>
     </w:p>
     <w:p>
@@ -1907,12 +3603,38 @@
     </w:p>
     <w:p>
       <w:r>
-        <w:t>            "employee_id": "02-2727",</w:t>
-      </w:r>
-    </w:p>
-    <w:p>
-      <w:r>
-        <w:t>            "employee_name": "Kazi Golam Mortuja",</w:t>
+        <w:t>            "</w:t>
+      </w:r>
+      <w:proofErr w:type="spellStart"/>
+      <w:proofErr w:type="gramStart"/>
+      <w:r>
+        <w:t>employee</w:t>
+      </w:r>
+      <w:proofErr w:type="gramEnd"/>
+      <w:r>
+        <w:t>_id</w:t>
+      </w:r>
+      <w:proofErr w:type="spellEnd"/>
+      <w:r>
+        <w:t>": "02-2727",</w:t>
+      </w:r>
+    </w:p>
+    <w:p>
+      <w:r>
+        <w:t>            "</w:t>
+      </w:r>
+      <w:proofErr w:type="spellStart"/>
+      <w:proofErr w:type="gramStart"/>
+      <w:r>
+        <w:t>employee</w:t>
+      </w:r>
+      <w:proofErr w:type="gramEnd"/>
+      <w:r>
+        <w:t>_name</w:t>
+      </w:r>
+      <w:proofErr w:type="spellEnd"/>
+      <w:r>
+        <w:t>": "Kazi Golam Mortuja",</w:t>
       </w:r>
     </w:p>
     <w:p>
@@ -1932,32 +3654,110 @@
     </w:p>
     <w:p>
       <w:r>
-        <w:t>            "tier_level": 1,</w:t>
-      </w:r>
-    </w:p>
-    <w:p>
-      <w:r>
-        <w:t>            "mr_number": "",</w:t>
-      </w:r>
-    </w:p>
-    <w:p>
-      <w:r>
-        <w:t>            "pr_number": "FAHSC02-20142025-11-03PR13983AA",</w:t>
-      </w:r>
-    </w:p>
-    <w:p>
-      <w:r>
-        <w:t>            "assigned_date": "2026-01-19 17:49:20+06",</w:t>
-      </w:r>
-    </w:p>
-    <w:p>
-      <w:r>
-        <w:t>            "purchase_date": "",</w:t>
-      </w:r>
-    </w:p>
-    <w:p>
-      <w:r>
-        <w:t>            "warranty_date": "2027-01-19 17:49:24+06",</w:t>
+        <w:t>            "</w:t>
+      </w:r>
+      <w:proofErr w:type="spellStart"/>
+      <w:proofErr w:type="gramStart"/>
+      <w:r>
+        <w:t>tier</w:t>
+      </w:r>
+      <w:proofErr w:type="gramEnd"/>
+      <w:r>
+        <w:t>_level</w:t>
+      </w:r>
+      <w:proofErr w:type="spellEnd"/>
+      <w:r>
+        <w:t>": 1,</w:t>
+      </w:r>
+    </w:p>
+    <w:p>
+      <w:r>
+        <w:t>            "</w:t>
+      </w:r>
+      <w:proofErr w:type="spellStart"/>
+      <w:proofErr w:type="gramStart"/>
+      <w:r>
+        <w:t>mr</w:t>
+      </w:r>
+      <w:proofErr w:type="gramEnd"/>
+      <w:r>
+        <w:t>_number</w:t>
+      </w:r>
+      <w:proofErr w:type="spellEnd"/>
+      <w:r>
+        <w:t>": "",</w:t>
+      </w:r>
+    </w:p>
+    <w:p>
+      <w:r>
+        <w:t>            "</w:t>
+      </w:r>
+      <w:proofErr w:type="spellStart"/>
+      <w:proofErr w:type="gramStart"/>
+      <w:r>
+        <w:t>pr</w:t>
+      </w:r>
+      <w:proofErr w:type="gramEnd"/>
+      <w:r>
+        <w:t>_number</w:t>
+      </w:r>
+      <w:proofErr w:type="spellEnd"/>
+      <w:r>
+        <w:t>": "FAHSC02-20142025-11-03PR13983AA",</w:t>
+      </w:r>
+    </w:p>
+    <w:p>
+      <w:r>
+        <w:t>            "</w:t>
+      </w:r>
+      <w:proofErr w:type="spellStart"/>
+      <w:proofErr w:type="gramStart"/>
+      <w:r>
+        <w:t>assigned</w:t>
+      </w:r>
+      <w:proofErr w:type="gramEnd"/>
+      <w:r>
+        <w:t>_date</w:t>
+      </w:r>
+      <w:proofErr w:type="spellEnd"/>
+      <w:r>
+        <w:t>": "2026-01-19 17:49:20+06",</w:t>
+      </w:r>
+    </w:p>
+    <w:p>
+      <w:r>
+        <w:t>            "</w:t>
+      </w:r>
+      <w:proofErr w:type="spellStart"/>
+      <w:proofErr w:type="gramStart"/>
+      <w:r>
+        <w:t>purchase</w:t>
+      </w:r>
+      <w:proofErr w:type="gramEnd"/>
+      <w:r>
+        <w:t>_date</w:t>
+      </w:r>
+      <w:proofErr w:type="spellEnd"/>
+      <w:r>
+        <w:t>": "",</w:t>
+      </w:r>
+    </w:p>
+    <w:p>
+      <w:r>
+        <w:t>            "</w:t>
+      </w:r>
+      <w:proofErr w:type="spellStart"/>
+      <w:proofErr w:type="gramStart"/>
+      <w:r>
+        <w:t>warranty</w:t>
+      </w:r>
+      <w:proofErr w:type="gramEnd"/>
+      <w:r>
+        <w:t>_date</w:t>
+      </w:r>
+      <w:proofErr w:type="spellEnd"/>
+      <w:r>
+        <w:t>": "2027-01-19 17:49:24+06",</w:t>
       </w:r>
     </w:p>
     <w:p>
@@ -1982,7 +3782,20 @@
     </w:p>
     <w:p>
       <w:r>
-        <w:t>    "page_size": 20,</w:t>
+        <w:t>    "</w:t>
+      </w:r>
+      <w:proofErr w:type="spellStart"/>
+      <w:proofErr w:type="gramStart"/>
+      <w:r>
+        <w:t>page</w:t>
+      </w:r>
+      <w:proofErr w:type="gramEnd"/>
+      <w:r>
+        <w:t>_size</w:t>
+      </w:r>
+      <w:proofErr w:type="spellEnd"/>
+      <w:r>
+        <w:t>": 20,</w:t>
       </w:r>
     </w:p>
     <w:p>
@@ -2012,6 +3825,312 @@
       </w:r>
     </w:p>
     <w:p/>
+    <w:p/>
+    <w:p/>
+    <w:p/>
+    <w:p>
+      <w:r>
+        <w:t>SELECT</w:t>
+      </w:r>
+    </w:p>
+    <w:p>
+      <w:r>
+        <w:t xml:space="preserve">    u.id,</w:t>
+      </w:r>
+    </w:p>
+    <w:p>
+      <w:r>
+        <w:t xml:space="preserve">    </w:t>
+      </w:r>
+      <w:proofErr w:type="spellStart"/>
+      <w:proofErr w:type="gramStart"/>
+      <w:r>
+        <w:t>u.username</w:t>
+      </w:r>
+      <w:proofErr w:type="spellEnd"/>
+      <w:proofErr w:type="gramEnd"/>
+      <w:r>
+        <w:t>,</w:t>
+      </w:r>
+    </w:p>
+    <w:p>
+      <w:r>
+        <w:t xml:space="preserve">    </w:t>
+      </w:r>
+      <w:proofErr w:type="spellStart"/>
+      <w:proofErr w:type="gramStart"/>
+      <w:r>
+        <w:t>u.employee</w:t>
+      </w:r>
+      <w:proofErr w:type="gramEnd"/>
+      <w:r>
+        <w:t>_id</w:t>
+      </w:r>
+      <w:proofErr w:type="spellEnd"/>
+      <w:r>
+        <w:t>,</w:t>
+      </w:r>
+    </w:p>
+    <w:p>
+      <w:r>
+        <w:t xml:space="preserve">    </w:t>
+      </w:r>
+      <w:proofErr w:type="spellStart"/>
+      <w:r>
+        <w:t>u.user_type</w:t>
+      </w:r>
+      <w:proofErr w:type="spellEnd"/>
+      <w:r>
+        <w:t>,</w:t>
+      </w:r>
+    </w:p>
+    <w:p/>
+    <w:p>
+      <w:r>
+        <w:t xml:space="preserve">    </w:t>
+      </w:r>
+      <w:proofErr w:type="spellStart"/>
+      <w:proofErr w:type="gramStart"/>
+      <w:r>
+        <w:t>ur.role</w:t>
+      </w:r>
+      <w:proofErr w:type="gramEnd"/>
+      <w:r>
+        <w:t>_id</w:t>
+      </w:r>
+      <w:proofErr w:type="spellEnd"/>
+      <w:r>
+        <w:t>,</w:t>
+      </w:r>
+    </w:p>
+    <w:p>
+      <w:r>
+        <w:t xml:space="preserve">    </w:t>
+      </w:r>
+      <w:proofErr w:type="spellStart"/>
+      <w:proofErr w:type="gramStart"/>
+      <w:r>
+        <w:t>ur.active</w:t>
+      </w:r>
+      <w:proofErr w:type="spellEnd"/>
+      <w:proofErr w:type="gramEnd"/>
+      <w:r>
+        <w:t xml:space="preserve"> AS </w:t>
+      </w:r>
+      <w:proofErr w:type="spellStart"/>
+      <w:r>
+        <w:t>user_role_active</w:t>
+      </w:r>
+      <w:proofErr w:type="spellEnd"/>
+      <w:r>
+        <w:t>,</w:t>
+      </w:r>
+    </w:p>
+    <w:p>
+      <w:r>
+        <w:t xml:space="preserve">    </w:t>
+      </w:r>
+      <w:proofErr w:type="spellStart"/>
+      <w:proofErr w:type="gramStart"/>
+      <w:r>
+        <w:t>ur.expires</w:t>
+      </w:r>
+      <w:proofErr w:type="gramEnd"/>
+      <w:r>
+        <w:t>_at</w:t>
+      </w:r>
+      <w:proofErr w:type="spellEnd"/>
+      <w:r>
+        <w:t>,</w:t>
+      </w:r>
+    </w:p>
+    <w:p/>
+    <w:p>
+      <w:r>
+        <w:t xml:space="preserve">    </w:t>
+      </w:r>
+      <w:proofErr w:type="spellStart"/>
+      <w:proofErr w:type="gramStart"/>
+      <w:r>
+        <w:t>r.code</w:t>
+      </w:r>
+      <w:proofErr w:type="spellEnd"/>
+      <w:proofErr w:type="gramEnd"/>
+      <w:r>
+        <w:t xml:space="preserve"> AS </w:t>
+      </w:r>
+      <w:proofErr w:type="spellStart"/>
+      <w:r>
+        <w:t>role_code</w:t>
+      </w:r>
+      <w:proofErr w:type="spellEnd"/>
+      <w:r>
+        <w:t>,</w:t>
+      </w:r>
+    </w:p>
+    <w:p>
+      <w:r>
+        <w:t xml:space="preserve">    r.name AS </w:t>
+      </w:r>
+      <w:proofErr w:type="spellStart"/>
+      <w:r>
+        <w:t>role_name</w:t>
+      </w:r>
+      <w:proofErr w:type="spellEnd"/>
+      <w:r>
+        <w:t>,</w:t>
+      </w:r>
+    </w:p>
+    <w:p>
+      <w:r>
+        <w:t xml:space="preserve">    </w:t>
+      </w:r>
+      <w:proofErr w:type="spellStart"/>
+      <w:proofErr w:type="gramStart"/>
+      <w:r>
+        <w:t>r.legacy</w:t>
+      </w:r>
+      <w:proofErr w:type="gramEnd"/>
+      <w:r>
+        <w:t>_user_type</w:t>
+      </w:r>
+      <w:proofErr w:type="spellEnd"/>
+      <w:r>
+        <w:t>,</w:t>
+      </w:r>
+    </w:p>
+    <w:p>
+      <w:r>
+        <w:t xml:space="preserve">    </w:t>
+      </w:r>
+      <w:proofErr w:type="spellStart"/>
+      <w:proofErr w:type="gramStart"/>
+      <w:r>
+        <w:t>r.hierarchy</w:t>
+      </w:r>
+      <w:proofErr w:type="gramEnd"/>
+      <w:r>
+        <w:t>_level</w:t>
+      </w:r>
+      <w:proofErr w:type="spellEnd"/>
+      <w:r>
+        <w:t>,</w:t>
+      </w:r>
+    </w:p>
+    <w:p>
+      <w:r>
+        <w:t xml:space="preserve">    </w:t>
+      </w:r>
+      <w:proofErr w:type="spellStart"/>
+      <w:proofErr w:type="gramStart"/>
+      <w:r>
+        <w:t>r.active</w:t>
+      </w:r>
+      <w:proofErr w:type="spellEnd"/>
+      <w:proofErr w:type="gramEnd"/>
+      <w:r>
+        <w:t xml:space="preserve"> AS </w:t>
+      </w:r>
+      <w:proofErr w:type="spellStart"/>
+      <w:r>
+        <w:t>role_active</w:t>
+      </w:r>
+      <w:proofErr w:type="spellEnd"/>
+    </w:p>
+    <w:p/>
+    <w:p>
+      <w:r>
+        <w:t xml:space="preserve">FROM </w:t>
+      </w:r>
+      <w:proofErr w:type="spellStart"/>
+      <w:proofErr w:type="gramStart"/>
+      <w:r>
+        <w:t>public.users</w:t>
+      </w:r>
+      <w:proofErr w:type="spellEnd"/>
+      <w:proofErr w:type="gramEnd"/>
+      <w:r>
+        <w:t xml:space="preserve"> u</w:t>
+      </w:r>
+    </w:p>
+    <w:p/>
+    <w:p>
+      <w:r>
+        <w:t xml:space="preserve">LEFT JOIN </w:t>
+      </w:r>
+      <w:proofErr w:type="spellStart"/>
+      <w:proofErr w:type="gramStart"/>
+      <w:r>
+        <w:t>public.auth</w:t>
+      </w:r>
+      <w:proofErr w:type="gramEnd"/>
+      <w:r>
+        <w:t>_user_roles</w:t>
+      </w:r>
+      <w:proofErr w:type="spellEnd"/>
+      <w:r>
+        <w:t xml:space="preserve"> </w:t>
+      </w:r>
+      <w:proofErr w:type="spellStart"/>
+      <w:r>
+        <w:t>ur</w:t>
+      </w:r>
+      <w:proofErr w:type="spellEnd"/>
+    </w:p>
+    <w:p>
+      <w:r>
+        <w:t xml:space="preserve">    ON </w:t>
+      </w:r>
+      <w:proofErr w:type="spellStart"/>
+      <w:r>
+        <w:t>ur.user_id</w:t>
+      </w:r>
+      <w:proofErr w:type="spellEnd"/>
+      <w:r>
+        <w:t xml:space="preserve"> = u.id</w:t>
+      </w:r>
+    </w:p>
+    <w:p/>
+    <w:p>
+      <w:r>
+        <w:lastRenderedPageBreak/>
+        <w:t xml:space="preserve">LEFT JOIN </w:t>
+      </w:r>
+      <w:proofErr w:type="spellStart"/>
+      <w:proofErr w:type="gramStart"/>
+      <w:r>
+        <w:t>public.auth</w:t>
+      </w:r>
+      <w:proofErr w:type="gramEnd"/>
+      <w:r>
+        <w:t>_roles</w:t>
+      </w:r>
+      <w:proofErr w:type="spellEnd"/>
+      <w:r>
+        <w:t xml:space="preserve"> r</w:t>
+      </w:r>
+    </w:p>
+    <w:p>
+      <w:r>
+        <w:t xml:space="preserve">    ON r.id = </w:t>
+      </w:r>
+      <w:proofErr w:type="spellStart"/>
+      <w:proofErr w:type="gramStart"/>
+      <w:r>
+        <w:t>ur.role</w:t>
+      </w:r>
+      <w:proofErr w:type="gramEnd"/>
+      <w:r>
+        <w:t>_id</w:t>
+      </w:r>
+      <w:proofErr w:type="spellEnd"/>
+    </w:p>
+    <w:p/>
+    <w:p>
+      <w:r>
+        <w:t>ORDER BY u.id;</w:t>
+      </w:r>
+    </w:p>
     <w:sectPr>
       <w:pgSz w:w="12240" w:h="15840"/>
       <w:pgMar w:top="1440" w:right="1440" w:bottom="1440" w:left="1440" w:header="720" w:footer="720" w:gutter="0"/>
@@ -2625,6 +4744,7 @@
   <w:style w:type="character" w:default="1" w:styleId="DefaultParagraphFont">
     <w:name w:val="Default Paragraph Font"/>
     <w:uiPriority w:val="1"/>
+    <w:semiHidden/>
     <w:unhideWhenUsed/>
   </w:style>
   <w:style w:type="table" w:default="1" w:styleId="TableNormal">

</xml_diff>